<commit_message>
draft: drop figure duplicating Table 2 (page budget for Study 2)
</commit_message>
<xml_diff>
--- a/paper/DRAFT.docx
+++ b/paper/DRAFT.docx
@@ -729,6 +729,17 @@
       </w:r>
       <w:r>
         <w:t xml:space="preserve"> The question, conditions, detectors, decision rule and outcomes were frozen in PREREG.md (git tag prereg-v1) before any market of the main grid ran, and the analysis code was committed (tag analysis-frozen-v1) before the results existed.</w:t>
+      </w:r>
+    </w:p>
+    <w:p>
+      <w:r>
+        <w:rPr>
+          <w:b/>
+        </w:rPr>
+        <w:t xml:space="preserve">Study 2: a confirmatory test.</w:t>
+      </w:r>
+      <w:r>
+        <w:t xml:space="preserve"> Study 1's results suggested a better plus-factor rule, so I froze a second preregistration (study2/PREREG.md, tag prereg2-v1) before running any new market, and then ran Study 2 on new seeds 8 to 15. It keeps C1 to C5 and C7, drops C6, and adds C8, a stronger positive control in which sellers are told they agreed a price floor of $95. Every threshold comes from Study 1 and none is tuned on Study 2. It tests two rules that need both kinds of evidence: X1, a high price (D1) plus judged coordination talk (D2), and D5, a high price plus talk that proposes holding a common price at or above the D1 price, as read by a new extraction judge. The extraction judge does not rate "coordination"; it reports whether sellers propose a common price, which way the proposal pushes prices, and the price named, and code applies the rule. I checked its prompt on 9 Study 1 hours before freezing it. The same judge also runs with Llama-3.1-8B-Instruct, to test whether the judge's model family matters. Known positives are C1 and C8, and known negatives are the no-channel decoys and the talk-without-action markets. The main test (H5) asks whether D5 makes fewer errors than price level or the vendored judge alone.</w:t>
       </w:r>
     </w:p>
     <w:p>
@@ -804,7 +815,7 @@
         <w:t xml:space="preserve">Held-out detector rates.</w:t>
       </w:r>
       <w:r>
-        <w:t xml:space="preserve"> Table 2 and Figure 2 give each detector's rates on the held-out seeds. A flag on C1 is correct; a flag on a no-channel decoy or on a talk-without-action market is a false alarm.</w:t>
+        <w:t xml:space="preserve"> Table 2 gives each detector's rates on the held-out seeds. A flag on C1 is correct; a flag on a no-channel decoy or on a talk-without-action market is a false alarm.</w:t>
       </w:r>
     </w:p>
     <w:p>
@@ -1217,10 +1228,32 @@
     </w:tbl>
     <w:p>
       <w:r>
+        <w:rPr>
+          <w:b/>
+        </w:rPr>
+        <w:t xml:space="preserve">Price level (D1).</w:t>
+      </w:r>
+      <w:r>
+        <w:t xml:space="preserve"> The frozen threshold was a collusion index of 0.29. D1 caught 2 of 4 held-out planted markets and flagged 2 of 12 decoys. Both false alarms were three-Llama markets with no channel (C7). In those markets the Llama sellers lowered their asks slowly from the opening level and traded little; in seed 6 no trade happened in 15 hours. Llama sellers also failed to return a usable reply more often (68 failed replies in all, 13% of decisions in C7, none in the Qwen-only conditions), and a seller that fails keeps its previous ask; dropping the 7 markets where more than 10% of decisions failed leaves D1 flagging 1 of 8 held-out decoys. In an exploratory, threshold-free comparison over all seeds, a C1 market had a higher index than a C2 market in 0.95 of pairs, and than any decoy in 0.88 of pairs.</w:t>
+      </w:r>
+    </w:p>
+    <w:p>
+      <w:r>
+        <w:rPr>
+          <w:b/>
+        </w:rPr>
+        <w:t xml:space="preserve">Action dependence (D3).</w:t>
+      </w:r>
+      <w:r>
+        <w:t xml:space="preserve"> Without any channel, sellers' ask changes moved together more than they did under a planted agreement. Mean dependence was 0.28 [0.09, 0.46] in C2 and 0.02 [-0.10, 0.15] in C1. On the calibration seeds no D3 threshold beat flagging nothing, so under the preregistered rule D3 flags no market (DEVIATIONS.md, D5). The exploratory threshold-free score for C1 against C2 was 0.22, where 0.5 is chance and lower values mean the decoys look more coordinated. Figure 2 shows why. With no channel, three copies of Qwen undercut one another towards cost in step, which produces strongly correlated changes. Under the planted agreement each seller holds its own idea of the common ask, so its changes are small and unrelated to the others'. Correlated conduct is here a sign of competition, not of agreement.</w:t>
+      </w:r>
+    </w:p>
+    <w:p>
+      <w:r>
         <w:drawing>
           <wp:inline distT="0" distB="0" distL="0" distR="0">
-            <wp:extent cx="5486400" cy="3037722"/>
-            <wp:docPr id="2" name="Figure 2" descr="Figure 2: Share of held-out markets each detector flags, with Wilson 95% intervals. On C1 a flag is correct; on the no-channel decoys and on talk-without-action markets (C3 messages spliced onto C2 actions) a flag is a false alarm. D3 flags no market because no calibration threshold beat flagging nothing. The hatched bar is an exploratory rule added after the results were read."/>
+            <wp:extent cx="5486400" cy="2503828"/>
+            <wp:docPr id="2" name="Figure 2" descr="Figure 2: Seller asks per hour. Left: the held-out no-channel market with the highest action dependence, chosen by that rule rather than by eye. Right: the first held-out planted-agreement market. Dotted lines mark seller cost ($80) and buyer value ($100)."/>
             <wp:cNvGraphicFramePr>
               <a:graphicFrameLocks noChangeAspect="1"/>
             </wp:cNvGraphicFramePr>
@@ -1240,74 +1273,6 @@
                   <pic:spPr>
                     <a:xfrm>
                       <a:off x="0" y="0"/>
-                      <a:ext cx="5486400" cy="3037722"/>
-                    </a:xfrm>
-                    <a:prstGeom prst="rect">
-                      <a:avLst/>
-                    </a:prstGeom>
-                  </pic:spPr>
-                </pic:pic>
-              </a:graphicData>
-            </a:graphic>
-          </wp:inline>
-        </w:drawing>
-      </w:r>
-    </w:p>
-    <w:p>
-      <w:r>
-        <w:rPr>
-          <w:i/>
-        </w:rPr>
-        <w:t xml:space="preserve">Figure 2: Share of held-out markets each detector flags, with Wilson 95% intervals. On C1 a flag is correct; on the no-channel decoys and on talk-without-action markets (C3 messages spliced onto C2 actions) a flag is a false alarm. D3 flags no market because no calibration threshold beat flagging nothing. The hatched bar is an exploratory rule added after the results were read.</w:t>
-      </w:r>
-    </w:p>
-    <w:p>
-      <w:r>
-        <w:rPr>
-          <w:b/>
-        </w:rPr>
-        <w:t xml:space="preserve">Price level (D1).</w:t>
-      </w:r>
-      <w:r>
-        <w:t xml:space="preserve"> The frozen threshold was a collusion index of 0.29. D1 caught 2 of 4 held-out planted markets and flagged 2 of 12 decoys. Both false alarms were three-Llama markets with no channel (C7). In those markets the Llama sellers lowered their asks slowly from the opening level and traded little; in seed 6 no trade happened in 15 hours. Llama sellers also failed to return a usable reply more often (68 failed replies in all, 13% of decisions in C7, none in the Qwen-only conditions), and a seller that fails keeps its previous ask; dropping the 7 markets where more than 10% of decisions failed leaves D1 flagging 1 of 8 held-out decoys. In an exploratory, threshold-free comparison over all seeds, a C1 market had a higher index than a C2 market in 0.95 of pairs, and than any decoy in 0.88 of pairs.</w:t>
-      </w:r>
-    </w:p>
-    <w:p>
-      <w:r>
-        <w:rPr>
-          <w:b/>
-        </w:rPr>
-        <w:t xml:space="preserve">Action dependence (D3).</w:t>
-      </w:r>
-      <w:r>
-        <w:t xml:space="preserve"> Without any channel, sellers' ask changes moved together more than they did under a planted agreement. Mean dependence was 0.28 [0.09, 0.46] in C2 and 0.02 [-0.10, 0.15] in C1. On the calibration seeds no D3 threshold beat flagging nothing, so under the preregistered rule D3 flags no market (DEVIATIONS.md, D5). The exploratory threshold-free score for C1 against C2 was 0.22, where 0.5 is chance and lower values mean the decoys look more coordinated. Figure 3 shows why. With no channel, three copies of Qwen undercut one another towards cost in step, which produces strongly correlated changes. Under the planted agreement each seller holds its own idea of the common ask, so its changes are small and unrelated to the others'. Correlated conduct is here a sign of competition, not of agreement.</w:t>
-      </w:r>
-    </w:p>
-    <w:p>
-      <w:r>
-        <w:drawing>
-          <wp:inline distT="0" distB="0" distL="0" distR="0">
-            <wp:extent cx="5486400" cy="2503828"/>
-            <wp:docPr id="3" name="Figure 3" descr="Figure 3: Seller asks per hour. Left: the held-out no-channel market with the highest action dependence, chosen by that rule rather than by eye. Right: the first held-out planted-agreement market. Dotted lines mark seller cost ($80) and buyer value ($100)."/>
-            <wp:cNvGraphicFramePr>
-              <a:graphicFrameLocks noChangeAspect="1"/>
-            </wp:cNvGraphicFramePr>
-            <a:graphic>
-              <a:graphicData uri="http://schemas.openxmlformats.org/drawingml/2006/picture">
-                <pic:pic>
-                  <pic:nvPicPr>
-                    <pic:cNvPr id="3" name="image3.png"/>
-                    <pic:cNvPicPr/>
-                  </pic:nvPicPr>
-                  <pic:blipFill>
-                    <a:blip r:embed="rId103"/>
-                    <a:stretch>
-                      <a:fillRect/>
-                    </a:stretch>
-                  </pic:blipFill>
-                  <pic:spPr>
-                    <a:xfrm>
-                      <a:off x="0" y="0"/>
                       <a:ext cx="5486400" cy="2503828"/>
                     </a:xfrm>
                     <a:prstGeom prst="rect">
@@ -1326,7 +1291,7 @@
         <w:rPr>
           <w:i/>
         </w:rPr>
-        <w:t xml:space="preserve">Figure 3: Seller asks per hour. Left: the held-out no-channel market with the highest action dependence, chosen by that rule rather than by eye. Right: the first held-out planted-agreement market. Dotted lines mark seller cost ($80) and buyer value ($100).</w:t>
+        <w:t xml:space="preserve">Figure 2: Seller asks per hour. Left: the held-out no-channel market with the highest action dependence, chosen by that rule rather than by eye. Right: the first held-out planted-agreement market. Dotted lines mark seller cost ($80) and buyer value ($100).</w:t>
       </w:r>
     </w:p>
     <w:p>
@@ -1383,6 +1348,35 @@
         <w:rPr>
           <w:b/>
         </w:rPr>
+        <w:t xml:space="preserve">Study 2.</w:t>
+      </w:r>
+      <w:r>
+        <w:t xml:space="preserve"> &lt;&lt;FILL: Study 2 results: the C8 positive control (s2.pc.contrast, s2.pc.p), a table of TPR, FPR and errors per detector (s2.tpr.</w:t>
+      </w:r>
+      <w:r>
+        <w:rPr>
+          <w:i/>
+        </w:rPr>
+        <w:t xml:space="preserve">, s2.fpr.</w:t>
+      </w:r>
+      <w:r>
+        <w:t xml:space="preserve">, s2.errors.</w:t>
+      </w:r>
+      <w:r>
+        <w:rPr>
+          <w:i/>
+        </w:rPr>
+        <w:t xml:space="preserve">), H5 to H9 with Holm p-values, the extraction judge on talk at cost (s2.flag.D2x.at_cost against s2.flag.D2.at_cost) and on Study 1 (s2.study1.D2x.</w:t>
+      </w:r>
+      <w:r>
+        <w:t xml:space="preserve">), and judge-family agreement (s2.judge_family.kappa)&gt;&gt;</w:t>
+      </w:r>
+    </w:p>
+    <w:p>
+      <w:r>
+        <w:rPr>
+          <w:b/>
+        </w:rPr>
         <w:t xml:space="preserve">Hand labels.</w:t>
       </w:r>
       <w:r>
@@ -1453,7 +1447,12 @@
     </w:p>
     <w:p>
       <w:r>
-        <w:t xml:space="preserve">This project was prepared before the sprint, and that is disclosed here with dates. Before the sprint (14–17 October 2026) I chose the question, Claude drafted the question card and preregistration, which I reviewed, and the preregistration was frozen on 16 October. The harness that runs the Agrawal et al. [2] market through a logged client and the analysis code were built on 17 October, and the full 56-market grid ran on Kaggle from 17 to 18 October. The analysis and a first draft of this report were produced on 18 October. During the sprint weekend I &lt;&lt;FILL: what you actually did during the weekend, e.g. the two-pass hand labels, the judge-agreement analysis, any added condition or seeds, and rewriting this report&gt;&gt;.</w:t>
+        <w:t xml:space="preserve">Prior work, with dates. Before the sprint (14–18 October 2026) I chose the question. Claude drafted the question card and both preregistrations, which I reviewed. I froze the Study 1 preregistration on 16 October and the Study 2 preregistration on 18 October, each before its markets ran. The harness and analysis code were built on 17 and 18 October. Both studies ran on Kaggle between 17 and 19 October, and the analysis and a first draft of this report were produced in the same days. Study 2 was originally planned for the sprint weekend and was run early instead; study2/DEVIATIONS.md records the change.</w:t>
+      </w:r>
+    </w:p>
+    <w:p>
+      <w:r>
+        <w:t xml:space="preserve">New during the sprint weekend (23–25 October 2026): &lt;&lt;FILL: what you actually did during the sprint, for example the final rewrite of this report, final checks, and anything else; if the hand labels or the rewrite were done before the sprint, say so with dates&gt;&gt;</w:t>
       </w:r>
     </w:p>
     <w:p>
@@ -1468,7 +1467,7 @@
       <w:r>
         <w:t xml:space="preserve">[1] Fish, S., Gonczarowski, Y. A., Shorrer, R. I. (2024). Algorithmic Collusion by Large Language Models. arXiv:2404.00806. </w:t>
       </w:r>
-      <w:hyperlink r:id="rId104">
+      <w:hyperlink r:id="rId103">
         <w:r>
           <w:rPr>
             <w:color w:val="0563C1"/>
@@ -1482,7 +1481,7 @@
       <w:r>
         <w:t xml:space="preserve">[2] Agrawal, K., Teo, V., Vazquez, J. J., Kunnavakkam, S., Srikanth, V., Liu, A. (2025). Evaluating LLM Agent Collusion in Double Auctions. arXiv:2507.01413. </w:t>
       </w:r>
-      <w:hyperlink r:id="rId105">
+      <w:hyperlink r:id="rId104">
         <w:r>
           <w:rPr>
             <w:color w:val="0563C1"/>
@@ -1496,7 +1495,7 @@
       <w:r>
         <w:t xml:space="preserve">[3] Keppo, J., Li, Y., Tsoukalas, G., Yuan, N. (2026). On the Fragility of AI Agent Collusion. arXiv:2603.20281. </w:t>
       </w:r>
-      <w:hyperlink r:id="rId106">
+      <w:hyperlink r:id="rId105">
         <w:r>
           <w:rPr>
             <w:color w:val="0563C1"/>
@@ -1510,7 +1509,7 @@
       <w:r>
         <w:t xml:space="preserve">[4] Nakamura, M., Kumar, A., Das, S., Abdelnabi, S., Mahmud, S., Fioretto, F., Zilberstein, S., Bagdasarian, E. (2026). Colosseum: Auditing Collusion in Cooperative Multi-Agent Systems. arXiv:2602.15198. </w:t>
       </w:r>
-      <w:hyperlink r:id="rId107">
+      <w:hyperlink r:id="rId106">
         <w:r>
           <w:rPr>
             <w:color w:val="0563C1"/>
@@ -1524,7 +1523,7 @@
       <w:r>
         <w:t xml:space="preserve">[5] Xu, X., Wu, C., Lu, J., Tan, K., Tao, S., Hong, H. (2026). Collusion with Competitive Marginals: Price-Level Audits Are Blind by Construction. arXiv:2607.26385. </w:t>
       </w:r>
-      <w:hyperlink r:id="rId108">
+      <w:hyperlink r:id="rId107">
         <w:r>
           <w:rPr>
             <w:color w:val="0563C1"/>
@@ -1538,7 +1537,7 @@
       <w:r>
         <w:t xml:space="preserve">[6] Supreme Court of the United States (2007). Bell Atlantic Corp. v. Twombly, 550 U.S. 544. U.S. Reports. </w:t>
       </w:r>
-      <w:hyperlink r:id="rId109">
+      <w:hyperlink r:id="rId108">
         <w:r>
           <w:rPr>
             <w:color w:val="0563C1"/>
@@ -1552,7 +1551,7 @@
       <w:r>
         <w:t xml:space="preserve">[7] Kovacic, W. E., Marshall, R. C., Marx, L. M., White, H. L. (2011). Plus Factors and Agreement in Antitrust Law. Michigan Law Review 110(3), 393-436. </w:t>
       </w:r>
-      <w:hyperlink r:id="rId110">
+      <w:hyperlink r:id="rId109">
         <w:r>
           <w:rPr>
             <w:color w:val="0563C1"/>
@@ -1566,7 +1565,7 @@
       <w:r>
         <w:t xml:space="preserve">[8] Berger, L. F., Weiner, M. L., Jiang, W. (2025). Coordination by Code: Rethinking Antitrust Liability in the Age of AI Pricing. Antitrust 40(1), ABA Section of Antitrust Law. </w:t>
       </w:r>
-      <w:hyperlink r:id="rId111">
+      <w:hyperlink r:id="rId110">
         <w:r>
           <w:rPr>
             <w:color w:val="0563C1"/>
@@ -1580,7 +1579,7 @@
       <w:r>
         <w:t xml:space="preserve">[9] Rippin, J. L., Marshall, S. C., Africa, D. D., Schroeder de Witt, C. (2026). Tool Use Enables Undetectable Steganography in Multi-Agent LLM Systems. arXiv:2606.28425. </w:t>
       </w:r>
-      <w:hyperlink r:id="rId112">
+      <w:hyperlink r:id="rId111">
         <w:r>
           <w:rPr>
             <w:color w:val="0563C1"/>
@@ -1592,23 +1591,14 @@
     </w:p>
     <w:p>
       <w:r>
-        <w:t xml:space="preserve">[10] Cliff, D. (1997). Minimal-Intelligence Agents for Bargaining Behaviours in Market-Based Environments. HP Laboratories Technical Report HPL-97-91. </w:t>
-      </w:r>
-      <w:hyperlink r:id="rId113">
-        <w:r>
-          <w:rPr>
-            <w:color w:val="0563C1"/>
-            <w:u w:val="single"/>
-          </w:rPr>
-          <w:t xml:space="preserve">https://www.hpl.hp.com/techreports/97/HPL-97-91.html</w:t>
-        </w:r>
-      </w:hyperlink>
+        <w:t xml:space="preserve">[10] Cliff, D. (1997). Minimal-Intelligence Agents for Bargaining Behaviours in Market-Based Environments. Hewlett-Packard Laboratories Technical Report HPL-97-91.</w:t>
+      </w:r>
     </w:p>
     <w:p>
       <w:r>
         <w:t xml:space="preserve">[11] Qwen Team (2024). Qwen2.5 Technical Report. arXiv:2412.15115. </w:t>
       </w:r>
-      <w:hyperlink r:id="rId114">
+      <w:hyperlink r:id="rId112">
         <w:r>
           <w:rPr>
             <w:color w:val="0563C1"/>
@@ -1622,7 +1612,7 @@
       <w:r>
         <w:t xml:space="preserve">[12] Grattafiori, A., et al. (2024). The Llama 3 Herd of Models. arXiv:2407.21783. </w:t>
       </w:r>
-      <w:hyperlink r:id="rId115">
+      <w:hyperlink r:id="rId113">
         <w:r>
           <w:rPr>
             <w:color w:val="0563C1"/>

</xml_diff>

<commit_message>
Study 2 results (56/56 markets): analysis, paper rewritten around both studies (abstract, results, discussion, conclusion), Socony-Vacuum reference, facts sheet, red team; page check: main text ends on page 7
</commit_message>
<xml_diff>
--- a/paper/DRAFT.docx
+++ b/paper/DRAFT.docx
@@ -20,7 +20,7 @@
     </w:p>
     <w:p>
       <w:r>
-        <w:t xml:space="preserve">A market auditor who sees AI pricing agents move prices together must decide whether that is evidence of collusion. Antitrust law says parallel conduct alone is not, and asks for plus factors. I test this on LLM sellers in the double auction of Agrawal et al., using markets with no message channel, where agreement is impossible, as decoys. Planted coordination raised the collusion index from 0.03 to 0.30 of the way from cost to buyer value, passing the positive control. No preregistered detector worked alone. Ask changes moved together more without a channel than under a planted agreement, so action dependence could not be calibrated. An LLM message judge flagged all 24 channel markets without planted coordination, though every one priced at cost. Price level caught 2 of 4 held-out planted markets and 2 of 12 decoys. A preregistered plus-factor rule raised no false alarms on decoys but caught nothing.</w:t>
+        <w:t xml:space="preserve">A market auditor who sees AI pricing agents move prices together must decide whether that is evidence of collusion; antitrust law says parallel conduct alone is not. I test this on LLM sellers in the Agrawal et al. double auction, in two preregistered studies of 56 markets each, with no-channel markets, where agreement is impossible, as decoys. Planted agreements raised the collusion index to 0.30, and to 0.75 with an explicit price floor, against 0.03 without a channel. No single signal was reliable: prices moved together more without a channel than under planted agreement, and an LLM judge flagged all 24 channel markets that priced at cost. In the confirmatory study, a judge extracting the proposed price cut those false alarms from 15 of 15 to 7 (Holm p = 0.04). Requiring high prices plus price-holding talk raised no false alarm on 32 known negatives but missed failed agreements.</w:t>
       </w:r>
     </w:p>
     <w:p>
@@ -80,17 +80,17 @@
     </w:p>
     <w:p>
       <w:r>
-        <w:t xml:space="preserve">Thresholds are frozen on calibration seeds before held-out markets are scored. Two further tests target failure modes named in Track 2.3: talk without action, and a monitoring attack.</w:t>
-      </w:r>
-    </w:p>
-    <w:p>
-      <w:r>
-        <w:t xml:space="preserve">Every single signal failed, each in a different way. Without a channel, sellers' price changes moved together more than they did under a planted agreement, because copies of one model competing towards cost move in step. The message judge flagged every market with a channel, including all those where prices stayed at cost. Price level flagged two Llama markets where no agreement was possible. The preregistered plus-factor rule raised no false alarms but also missed planted coordination, because it looked for correlated price changes, while an agreement to hold a price leaves a high and flat price. An exploratory rule that requires both high prices and coordination talk avoided every false alarm, and is the hypothesis this study leaves for the next one.</w:t>
-      </w:r>
-    </w:p>
-    <w:p>
-      <w:r>
-        <w:t xml:space="preserve">The intended user is a market auditor deciding whether parallel pricing alone justifies a collusion finding. The contributions are a decoy design that separates parallel conduct from agreement in a standard LLM market, held-out false-alarm and detection rates for four detectors including an operational plus-factor rule, and the code, preregistration and every market log.</w:t>
+        <w:t xml:space="preserve">Thresholds are frozen on calibration seeds before held-out markets are scored, and two failure modes named in Track 2.3 are tested directly: talk without action, and a monitoring attack.</w:t>
+      </w:r>
+    </w:p>
+    <w:p>
+      <w:r>
+        <w:t xml:space="preserve">Every single signal failed, each in a different way. Without a channel, sellers' price changes moved together more than under a planted agreement, because copies of one model competing towards cost move in step. The message judge flagged every market with a channel, including all those where prices stayed at cost. Price level flagged two Llama markets where no agreement was possible. A second, preregistered study then tested the fixes these failures suggest. A judge that reports what price the sellers propose, instead of whether they sound coordinated, halved the false alarms on talk at cost. Rules that require both high prices and talk about holding a high common price raised no false alarm on any known negative, at the cost of missing agreements that fail to lift prices.</w:t>
+      </w:r>
+    </w:p>
+    <w:p>
+      <w:r>
+        <w:t xml:space="preserve">The intended user is a market auditor deciding whether parallel pricing alone justifies a collusion finding. The contributions are a decoy design that separates parallel conduct from agreement in a standard LLM market; held-out false-alarm and detection rates for single signals and plus-factor rules across two preregistered studies; a message judge that extracts proposed prices; and the code, both preregistrations and every market log.</w:t>
       </w:r>
     </w:p>
     <w:p>
@@ -159,7 +159,7 @@
         <w:t xml:space="preserve">Market.</w:t>
       </w:r>
       <w:r>
-        <w:t xml:space="preserve"> I use the continuous double auction of Agrawal et al. [2] unchanged, from the authors' public code at a pinned commit (vendor/NOTICE in the repository). Three LLM sellers, each with a cost of $80 per lot, face three scripted buyers with a value of $100 per lot. The buyers follow the ZIP rule [10], a simple adaptive bidding strategy, so any rise in prices comes from the sellers. The market runs for 15 hours. Each hour, every seller sees the order book, its past trades, its own memory notes and, when the channel is on, the messages the other sellers sent the previous hour (up to 500 characters each). It returns an ask for one lot and, when the channel is on, a message. A trade happens when the highest bid meets the lowest ask, at the midpoint. All sellers use temperature 0.7 and at most 1024 output tokens.</w:t>
+        <w:t xml:space="preserve"> I use the continuous double auction of Agrawal et al. [2] unchanged, from the authors' public code at a pinned commit. Three LLM sellers, each with a cost of $80 per lot, face three scripted buyers that follow the adaptive ZIP rule [10] with a value of $100 per lot, so any rise in prices comes from the sellers. Each of 15 hours, every seller sees the order book, its past trades, its own notes and, when the channel is on, the other sellers' messages from the previous hour (up to 500 characters). It returns an ask and, with a channel, a message. Trades happen at the midpoint when bid meets ask. Sellers use temperature 0.7 and at most 1024 output tokens.</w:t>
       </w:r>
     </w:p>
     <w:p>
@@ -170,7 +170,7 @@
         <w:t xml:space="preserve">Models.</w:t>
       </w:r>
       <w:r>
-        <w:t xml:space="preserve"> The sellers are Qwen2.5-7B-Instruct [11] and Llama-3.1-8B-Instruct [12] (Ollama tags qwen2.5:7b and llama3.1:8b), served by Ollama with its default 4-bit weights on two Kaggle T4 GPUs. All calls went through one logged client; the full call ledger is in the repository. The study used no paid API.</w:t>
+        <w:t xml:space="preserve"> The sellers are Qwen2.5-7B-Instruct [11] and Llama-3.1-8B-Instruct [12], served by Ollama with 4-bit weights on two Kaggle T4 GPUs, through one logged client. No paid API was used.</w:t>
       </w:r>
     </w:p>
     <w:p>
@@ -181,12 +181,12 @@
         <w:t xml:space="preserve">Conditions.</w:t>
       </w:r>
       <w:r>
-        <w:t xml:space="preserve"> Table 1 lists the seven conditions. Each ran with 8 seeds, giving 56 markets.</w:t>
-      </w:r>
-    </w:p>
-    <w:p>
-      <w:r>
-        <w:t xml:space="preserve">Table 1: The seven conditions. "Channel" means sellers can message each other.</w:t>
+        <w:t xml:space="preserve"> Table 1 lists the conditions; Study 1 ran C1 to C7 with 8 seeds each (56 markets).</w:t>
+      </w:r>
+    </w:p>
+    <w:p>
+      <w:r>
+        <w:t xml:space="preserve">Table 1: Conditions. "Channel" means sellers can message each other. C8 is in Study 2 only, and C6 in Study 1 only.</w:t>
       </w:r>
     </w:p>
     <w:tbl>
@@ -312,7 +312,7 @@
           </w:tcPr>
           <w:p>
             <w:r>
-              <w:t xml:space="preserve">told before the market that they agreed to coordinate on a common high ask</w:t>
+              <w:t xml:space="preserve">told they agreed to coordinate on a common high ask</w:t>
             </w:r>
           </w:p>
         </w:tc>
@@ -370,7 +370,7 @@
           </w:tcPr>
           <w:p>
             <w:r>
-              <w:t xml:space="preserve">decoy, calibration baseline</w:t>
+              <w:t xml:space="preserve">decoy, baseline</w:t>
             </w:r>
           </w:p>
         </w:tc>
@@ -418,7 +418,7 @@
           </w:tcPr>
           <w:p>
             <w:r>
-              <w:t xml:space="preserve">channel, no instruction</w:t>
+              <w:t xml:space="preserve">talk, no planted agreement</w:t>
             </w:r>
           </w:p>
         </w:tc>
@@ -514,7 +514,7 @@
           </w:tcPr>
           <w:p>
             <w:r>
-              <w:t xml:space="preserve">channel, mixed models</w:t>
+              <w:t xml:space="preserve">talk, mixed models</w:t>
             </w:r>
           </w:p>
         </w:tc>
@@ -556,7 +556,7 @@
           </w:tcPr>
           <w:p>
             <w:r>
-              <w:t xml:space="preserve">told an overseer monitors messages; overseer active</w:t>
+              <w:t xml:space="preserve">told an overseer reads messages; overseer active</w:t>
             </w:r>
           </w:p>
         </w:tc>
@@ -614,7 +614,59 @@
           </w:tcPr>
           <w:p>
             <w:r>
-              <w:t xml:space="preserve">decoy, model-identity control</w:t>
+              <w:t xml:space="preserve">decoy, model identity</w:t>
+            </w:r>
+          </w:p>
+        </w:tc>
+      </w:tr>
+      <w:tr>
+        <w:tc>
+          <w:tcPr>
+            <w:tcW w:w="1800" w:type="dxa"/>
+          </w:tcPr>
+          <w:p>
+            <w:r>
+              <w:t xml:space="preserve">C8</w:t>
+            </w:r>
+          </w:p>
+        </w:tc>
+        <w:tc>
+          <w:tcPr>
+            <w:tcW w:w="1800" w:type="dxa"/>
+          </w:tcPr>
+          <w:p>
+            <w:r>
+              <w:t xml:space="preserve">3 Qwen</w:t>
+            </w:r>
+          </w:p>
+        </w:tc>
+        <w:tc>
+          <w:tcPr>
+            <w:tcW w:w="1800" w:type="dxa"/>
+          </w:tcPr>
+          <w:p>
+            <w:r>
+              <w:t xml:space="preserve">on</w:t>
+            </w:r>
+          </w:p>
+        </w:tc>
+        <w:tc>
+          <w:tcPr>
+            <w:tcW w:w="1800" w:type="dxa"/>
+          </w:tcPr>
+          <w:p>
+            <w:r>
+              <w:t xml:space="preserve">told they agreed a price floor of $95</w:t>
+            </w:r>
+          </w:p>
+        </w:tc>
+        <w:tc>
+          <w:tcPr>
+            <w:tcW w:w="1800" w:type="dxa"/>
+          </w:tcPr>
+          <w:p>
+            <w:r>
+              <w:t xml:space="preserve">strong positive control</w:t>
             </w:r>
           </w:p>
         </w:tc>
@@ -622,7 +674,7 @@
     </w:tbl>
     <w:p>
       <w:r>
-        <w:t xml:space="preserve">C2, C4 and C7 have no channel, so no agreement can form in them. They differ in how many sellers share a model, which is the variable the shared-prior explanation depends on. In C6 the overseer from Agrawal et al. [2] reads each hour's messages during the market; when it rates them 4 out of 4, every later message is limited to 5 characters for the rest of the market, as in the original code.</w:t>
+        <w:t xml:space="preserve">C2, C4 and C7 have no channel, so no agreement can form in them; they differ in how many sellers share a model. In C6 the overseer of Agrawal et al. [2] reads each hour's messages, and after it rates them 4 out of 4 every later message is limited to 5 characters.</w:t>
       </w:r>
     </w:p>
     <w:p>
@@ -633,7 +685,7 @@
         <w:t xml:space="preserve">Collusion index and positive control.</w:t>
       </w:r>
       <w:r>
-        <w:t xml:space="preserve"> For each market, the collusion index is the mean seller ask over the last 5 hours, rescaled so that 0 is seller cost and 1 is buyer value. The preregistered positive control requires the mean index of C1 to exceed that of C2 by at least 0.2. If it does not, the instrument cannot see planted coordination and the main results are not interpretable.</w:t>
+        <w:t xml:space="preserve"> The collusion index is the mean seller ask over the last 5 hours, rescaled so that 0 is seller cost and 1 is buyer value. Study 1's positive control requires C1 to beat C2 by at least 0.2.</w:t>
       </w:r>
     </w:p>
     <w:p>
@@ -649,7 +701,7 @@
         <w:t xml:space="preserve">• </w:t>
       </w:r>
       <w:r>
-        <w:t xml:space="preserve">D1 (price level) flags a market whose collusion index reaches a threshold.</w:t>
+        <w:t xml:space="preserve">D1 (price level): the collusion index reaches a threshold.</w:t>
       </w:r>
     </w:p>
     <w:p>
@@ -657,7 +709,7 @@
         <w:t xml:space="preserve">• </w:t>
       </w:r>
       <w:r>
-        <w:t xml:space="preserve">D2 (message judge) runs the overseer prompt from Agrawal et al. [2], unchanged, on each hour's seller messages after the market ends, at temperature 0, with Qwen2.5-7B-Instruct as the judge. It flags a market when any hour scores 3 or 4 on the prompt's 1 to 4 coordination scale. Markets without a channel have no messages, so D2 cannot flag them.</w:t>
+        <w:t xml:space="preserve">D2 (message judge): the overseer prompt of Agrawal et al. [2], unchanged, run after the market at temperature 0 with Qwen2.5-7B-Instruct, scores any hour 3 or 4 on its 1 to 4 scale.</w:t>
       </w:r>
     </w:p>
     <w:p>
@@ -665,7 +717,7 @@
         <w:t xml:space="preserve">• </w:t>
       </w:r>
       <w:r>
-        <w:t xml:space="preserve">D3 (action dependence) is the mean, over the three seller pairs, of the Pearson correlation between the two sellers' hour-to-hour ask changes. It flags a market whose dependence reaches a threshold.</w:t>
+        <w:t xml:space="preserve">D3 (action dependence): the mean, over seller pairs, of the correlation between hour-to-hour ask changes reaches a threshold.</w:t>
       </w:r>
     </w:p>
     <w:p>
@@ -673,7 +725,7 @@
         <w:t xml:space="preserve">• </w:t>
       </w:r>
       <w:r>
-        <w:t xml:space="preserve">D4 (plus-factor rule) flags a market only when both plus factors hold: (a) its dependence exceeds the 95th percentile of dependence in the C2 calibration markets, that is, more parallel than copies of the same model with no channel; and (b) at least one message the judge scored 3 or more is followed, within 2 hours, by a fall in the spread between the highest and lowest seller ask.</w:t>
+        <w:t xml:space="preserve">D4 (preregistered plus-factor rule): dependence above the 95th percentile of the C2 calibration markets, and a message scored 3 or more followed within 2 hours by a fall in the spread of asks.</w:t>
       </w:r>
     </w:p>
     <w:p>
@@ -681,54 +733,10 @@
         <w:rPr>
           <w:b/>
         </w:rPr>
-        <w:t xml:space="preserve">Calibration and held-out scoring.</w:t>
-      </w:r>
-      <w:r>
-        <w:t xml:space="preserve"> Seeds 0 to 3 of every condition are calibration markets and seeds 4 to 7 are held out. The D1 and D3 thresholds are the values that maximise true-positive rate on C1 minus false-positive rate on C2 in the calibration markets. D4's dependence cut is the C2 calibration percentile above. The analysis script writes these to disk before it opens any held-out file. The primary metrics are each detector's false-positive rate on held-out C2, C4 and C7 markets and true-positive rate on held-out C1 markets, with Wilson 95% intervals.</w:t>
-      </w:r>
-    </w:p>
-    <w:p>
-      <w:r>
-        <w:rPr>
-          <w:b/>
-        </w:rPr>
-        <w:t xml:space="preserve">Talk without action.</w:t>
-      </w:r>
-      <w:r>
-        <w:t xml:space="preserve"> To test whether a detector mistakes talk for collusion, I pair each C3 market (channel, messages, judge scores) with the C2 market of the same seed (no channel) and score the C2 actions together with the C3 messages. No action in these spliced markets responds to the messages, so any flag is a false alarm. No new markets are run for this test.</w:t>
-      </w:r>
-    </w:p>
-    <w:p>
-      <w:r>
-        <w:rPr>
-          <w:b/>
-        </w:rPr>
-        <w:t xml:space="preserve">Hypothesis tests.</w:t>
-      </w:r>
-      <w:r>
-        <w:t xml:space="preserve"> H1 (D1 and D3 flag no-channel decoys at more than 5%) uses exact binomial tests; H2 (same-model seller pairs are more dependent than cross-family pairs within C4) an exact sign-flip test; H3 (D4 has fewer decoy false alarms than D1 and D3) exact McNemar tests; H4 (the monitoring warning lowers the judge's scores more than dependence, C6 against C3) permutation tests. P-values are Holm-corrected across the four. Where the preregistration left a detail open, the choice is listed in DEVIATIONS.md with the reason. Entries D1 to D4 were committed before the main grid ran; D5, about a threshold that turned out to be undefined, was written after, and says so.</w:t>
-      </w:r>
-    </w:p>
-    <w:p>
-      <w:r>
-        <w:rPr>
-          <w:b/>
-        </w:rPr>
-        <w:t xml:space="preserve">Hand labels.</w:t>
-      </w:r>
-      <w:r>
-        <w:t xml:space="preserve"> Because the judge is a model, I labelled every C3, C5 and C6 market for whether sellers reached an agreement, reading only the messages with condition, models and prices hidden, twice and at least a day apart in different orders. A market counts as an agreement only when both passes say so.</w:t>
-      </w:r>
-    </w:p>
-    <w:p>
-      <w:r>
-        <w:rPr>
-          <w:b/>
-        </w:rPr>
-        <w:t xml:space="preserve">Preregistration and code.</w:t>
-      </w:r>
-      <w:r>
-        <w:t xml:space="preserve"> The question, conditions, detectors, decision rule and outcomes were frozen in PREREG.md (git tag prereg-v1) before any market of the main grid ran, and the analysis code was committed (tag analysis-frozen-v1) before the results existed.</w:t>
+        <w:t xml:space="preserve">Study 1 protocol.</w:t>
+      </w:r>
+      <w:r>
+        <w:t xml:space="preserve"> Seeds 0 to 3 are calibration markets and seeds 4 to 7 are held out. The D1 and D3 thresholds maximise true-positive rate on C1 minus false-positive rate on C2 in the calibration markets; the analysis script writes them to disk before it opens a held-out file. For talk without action, each C3 market's messages are scored together with the actions of the C2 market of the same seed, so no action responds to the talk. H1 to H4 (decoy false alarms above 5%, same-model pair dependence, fewer D4 false alarms, monitoring) use exact binomial, sign-flip, McNemar and permutation tests with Holm correction. The preregistration is git tag prereg-v1 and the analysis code was tagged before results existed (analysis-frozen-v1); DEVIATIONS.md lists every open choice.</w:t>
       </w:r>
     </w:p>
     <w:p>
@@ -739,7 +747,7 @@
         <w:t xml:space="preserve">Study 2: a confirmatory test.</w:t>
       </w:r>
       <w:r>
-        <w:t xml:space="preserve"> Study 1's results suggested a better plus-factor rule, so I froze a second preregistration (study2/PREREG.md, tag prereg2-v1) before running any new market, and then ran Study 2 on new seeds 8 to 15. It keeps C1 to C5 and C7, drops C6, and adds C8, a stronger positive control in which sellers are told they agreed a price floor of $95. Every threshold comes from Study 1 and none is tuned on Study 2. It tests two rules that need both kinds of evidence: X1, a high price (D1) plus judged coordination talk (D2), and D5, a high price plus talk that proposes holding a common price at or above the D1 price, as read by a new extraction judge. The extraction judge does not rate "coordination"; it reports whether sellers propose a common price, which way the proposal pushes prices, and the price named, and code applies the rule. I checked its prompt on 9 Study 1 hours before freezing it. The same judge also runs with Llama-3.1-8B-Instruct, to test whether the judge's model family matters. Known positives are C1 and C8, and known negatives are the no-channel decoys and the talk-without-action markets. The main test (H5) asks whether D5 makes fewer errors than price level or the vendored judge alone.</w:t>
+        <w:t xml:space="preserve"> Study 1 suggested a better rule, so I froze a second preregistration (study2/PREREG.md, tag prereg2-v1) before running any new market. Study 2 runs C1 to C5, C7 and C8 on new seeds 8 to 15 (56 markets), with every threshold taken from Study 1. It adds an extraction judge, D2x: instead of rating "coordination", the model reports whether sellers propose or accept a common price, which way it pushes asks, and the price named, and code flags an hour when the proposed price is at or above the D1 threshold in dollars. I checked its prompt on 9 Study 1 hours before freezing it; a first prompt that asked the model to judge the direction itself failed that check and was dropped. The same judge also runs with Llama (D2x-L). Two rules require both kinds of evidence: X1 = D1 and D2, and D5 = D1 and D2x. Known positives are C1 and C8 (16 markets); known negatives are the decoys and 8 talk-without-action markets (32). H5 asks whether D5 makes fewer errors than D1 and than D2; H6 the same for X1; H7 whether D2x flags fewer than D2 on C3 and C5 markets priced at cost; H8 whether the judge's family changes D2x's flags; H9 replicates Study 1's dependence result. All use exact McNemar or permutation tests with Holm correction.</w:t>
       </w:r>
     </w:p>
     <w:p>
@@ -748,6 +756,14 @@
       </w:pPr>
       <w:r>
         <w:t xml:space="preserve">4. Results</w:t>
+      </w:r>
+    </w:p>
+    <w:p>
+      <w:pPr>
+        <w:pStyle w:val="Heading3"/>
+      </w:pPr>
+      <w:r>
+        <w:t xml:space="preserve">Study 1</w:t>
       </w:r>
     </w:p>
     <w:p>
@@ -758,7 +774,7 @@
         <w:t xml:space="preserve">Positive control.</w:t>
       </w:r>
       <w:r>
-        <w:t xml:space="preserve"> The planted instruction raised the mean collusion index from 0.03 in C2 to 0.30 in C1, a contrast of 0.27 against the preregistered minimum of 0.2 (permutation p = 0.001, 8 markets each). The instrument therefore sees planted coordination, and the other results are interpretable. The effect is smaller than the instruction suggests. In C1 the sellers announce a "common ask" in their first messages but often name different numbers, then cut prices over the market; Figure 1 shows three of the eight C1 markets ending below the D1 threshold. All 56 markets finished, with 3684 model calls, no truncated replies and no judge reply that failed to parse.</w:t>
+        <w:t xml:space="preserve"> The planted instruction raised the mean collusion index from 0.03 in C2 to 0.30 in C1, a contrast of 0.27 against the preregistered 0.2 (permutation p = 0.001). The sellers announced a "common ask" but often named different numbers and then cut prices; three of the eight C1 markets ended below the D1 threshold (Figure 1). All 56 markets finished, with 3684 model calls and no truncated replies.</w:t>
       </w:r>
     </w:p>
     <w:p>
@@ -766,7 +782,7 @@
         <w:drawing>
           <wp:inline distT="0" distB="0" distL="0" distR="0">
             <wp:extent cx="5486400" cy="2375965"/>
-            <wp:docPr id="1" name="Figure 1" descr="Figure 1: Collusion index of every market (x: calibration seeds 0-3, o: held-out seeds 4-7). Grey conditions have no message channel, so any agreement is impossible. The dashed line is the D1 threshold frozen on calibration seeds."/>
+            <wp:docPr id="1" name="Figure 1" descr="Figure 1: Collusion index of every Study 1 market (x: calibration seeds 0-3, o: held-out seeds 4-7). Grey conditions have no message channel, so any agreement is impossible. The dashed line is the D1 threshold frozen on calibration seeds."/>
             <wp:cNvGraphicFramePr>
               <a:graphicFrameLocks noChangeAspect="1"/>
             </wp:cNvGraphicFramePr>
@@ -804,23 +820,12 @@
         <w:rPr>
           <w:i/>
         </w:rPr>
-        <w:t xml:space="preserve">Figure 1: Collusion index of every market (x: calibration seeds 0-3, o: held-out seeds 4-7). Grey conditions have no message channel, so any agreement is impossible. The dashed line is the D1 threshold frozen on calibration seeds.</w:t>
-      </w:r>
-    </w:p>
-    <w:p>
-      <w:r>
-        <w:rPr>
-          <w:b/>
-        </w:rPr>
-        <w:t xml:space="preserve">Held-out detector rates.</w:t>
-      </w:r>
-      <w:r>
-        <w:t xml:space="preserve"> Table 2 gives each detector's rates on the held-out seeds. A flag on C1 is correct; a flag on a no-channel decoy or on a talk-without-action market is a false alarm.</w:t>
-      </w:r>
-    </w:p>
-    <w:p>
-      <w:r>
-        <w:t xml:space="preserve">Table 2: Held-out markets flagged by each detector (seeds 4 to 7). Decoys pool C2, C4 and C7. Brackets give Wilson 95% intervals for the pooled decoy rate.</w:t>
+        <w:t xml:space="preserve">Figure 1: Collusion index of every Study 1 market (x: calibration seeds 0-3, o: held-out seeds 4-7). Grey conditions have no message channel, so any agreement is impossible. The dashed line is the D1 threshold frozen on calibration seeds.</w:t>
+      </w:r>
+    </w:p>
+    <w:p>
+      <w:r>
+        <w:t xml:space="preserve">Table 2: Study 1, held-out markets flagged (seeds 4 to 7). Brackets give Wilson 95% intervals for the pooled decoy rate (C2, C4, C7).</w:t>
       </w:r>
     </w:p>
     <w:tbl>
@@ -1231,21 +1236,10 @@
         <w:rPr>
           <w:b/>
         </w:rPr>
-        <w:t xml:space="preserve">Price level (D1).</w:t>
-      </w:r>
-      <w:r>
-        <w:t xml:space="preserve"> The frozen threshold was a collusion index of 0.29. D1 caught 2 of 4 held-out planted markets and flagged 2 of 12 decoys. Both false alarms were three-Llama markets with no channel (C7). In those markets the Llama sellers lowered their asks slowly from the opening level and traded little; in seed 6 no trade happened in 15 hours. Llama sellers also failed to return a usable reply more often (68 failed replies in all, 13% of decisions in C7, none in the Qwen-only conditions), and a seller that fails keeps its previous ask; dropping the 7 markets where more than 10% of decisions failed leaves D1 flagging 1 of 8 held-out decoys. In an exploratory, threshold-free comparison over all seeds, a C1 market had a higher index than a C2 market in 0.95 of pairs, and than any decoy in 0.88 of pairs.</w:t>
-      </w:r>
-    </w:p>
-    <w:p>
-      <w:r>
-        <w:rPr>
-          <w:b/>
-        </w:rPr>
-        <w:t xml:space="preserve">Action dependence (D3).</w:t>
-      </w:r>
-      <w:r>
-        <w:t xml:space="preserve"> Without any channel, sellers' ask changes moved together more than they did under a planted agreement. Mean dependence was 0.28 [0.09, 0.46] in C2 and 0.02 [-0.10, 0.15] in C1. On the calibration seeds no D3 threshold beat flagging nothing, so under the preregistered rule D3 flags no market (DEVIATIONS.md, D5). The exploratory threshold-free score for C1 against C2 was 0.22, where 0.5 is chance and lower values mean the decoys look more coordinated. Figure 2 shows why. With no channel, three copies of Qwen undercut one another towards cost in step, which produces strongly correlated changes. Under the planted agreement each seller holds its own idea of the common ask, so its changes are small and unrelated to the others'. Correlated conduct is here a sign of competition, not of agreement.</w:t>
+        <w:t xml:space="preserve">Each single signal failed in its own way.</w:t>
+      </w:r>
+      <w:r>
+        <w:t xml:space="preserve"> Price level (threshold 0.29) caught 2 of 4 held-out planted markets but flagged 2 of 12 decoys, both three-Llama markets where sellers cut asks slowly and traded little. Llama sellers also failed to reply usably more often (68 failed replies in all, 13% of decisions in C7), which keeps old asks in place; dropping the 7 markets with more than 10% failures leaves 1 of 8 decoys flagged. Action dependence ran the wrong way: it was 0.28 [0.09, 0.46] in C2 and 0.02 [-0.10, 0.15] in C1, no threshold beat flagging nothing, and under the preregistered rule D3 flags no market (DEVIATIONS.md, D5). Figure 2 shows why. Without a channel, three copies of Qwen undercut each other towards cost in step; under the planted agreement each seller holds its own idea of the common ask. In mixed markets, same-model pairs were not more dependent than cross-family pairs (difference -0.09 [-0.41, 0.28], p = 0.69). The message judge flagged every channel market: all 4 held-out planted markets, and also all 24 C3, C5 and C6 markets, every one priced at cost (index below 0.1). The sellers do talk the language of coordination ("Let's keep our asks just below the lowest ask to maximize trades... Coordination is key."), but what they propose is a price cut. On talk-without-action markets the judge flagged 8 of 8. D4 (dependence cut 0.53) raised no false alarm on decoys but caught no planted market, since planted markets were not unusually parallel.</w:t>
       </w:r>
     </w:p>
     <w:p>
@@ -1253,7 +1247,7 @@
         <w:drawing>
           <wp:inline distT="0" distB="0" distL="0" distR="0">
             <wp:extent cx="5486400" cy="2503828"/>
-            <wp:docPr id="2" name="Figure 2" descr="Figure 2: Seller asks per hour. Left: the held-out no-channel market with the highest action dependence, chosen by that rule rather than by eye. Right: the first held-out planted-agreement market. Dotted lines mark seller cost ($80) and buyer value ($100)."/>
+            <wp:docPr id="2" name="Figure 2" descr="Figure 2: Seller asks per hour. Left: the held-out no-channel market with the highest action dependence, chosen by that rule. Right: the first held-out planted-agreement market. Dotted lines mark seller cost ($80) and buyer value ($100)."/>
             <wp:cNvGraphicFramePr>
               <a:graphicFrameLocks noChangeAspect="1"/>
             </wp:cNvGraphicFramePr>
@@ -1291,12 +1285,20 @@
         <w:rPr>
           <w:i/>
         </w:rPr>
-        <w:t xml:space="preserve">Figure 2: Seller asks per hour. Left: the held-out no-channel market with the highest action dependence, chosen by that rule rather than by eye. Right: the first held-out planted-agreement market. Dotted lines mark seller cost ($80) and buyer value ($100).</w:t>
-      </w:r>
-    </w:p>
-    <w:p>
-      <w:r>
-        <w:t xml:space="preserve">The shared-prior explanation got mixed support. In the mixed C4 markets, pairs of Qwen sellers were not more dependent than Qwen-Llama pairs (difference -0.09 [-0.41, 0.28], sign-flip p = 0.69), so H2 is not supported. At the market level, dependence was lower in mixed markets than in three-Qwen markets (0.04 against 0.28), but that exploratory comparison is not significant (permutation p = 0.12).</w:t>
+        <w:t xml:space="preserve">Figure 2: Seller asks per hour. Left: the held-out no-channel market with the highest action dependence, chosen by that rule. Right: the first held-out planted-agreement market. Dotted lines mark seller cost ($80) and buyer value ($100).</w:t>
+      </w:r>
+    </w:p>
+    <w:p>
+      <w:r>
+        <w:t xml:space="preserve">None of H1 to H4 is supported after Holm correction (all adjusted p = 1.00). Telling sellers they were monitored did not lower the judge's scores: every C6 market still reached 4, and dependence changed by -0.08 (p = 0.61); the sellers talked before the gag cut their messages to fragments such as "COMP". An exploratory rule found after reading these results, X1 = D1 and D2, flagged 2 of 4 held-out planted markets and none of the 12 decoys or 8 talk-without-action markets. Study 2 tests it.</w:t>
+      </w:r>
+    </w:p>
+    <w:p>
+      <w:pPr>
+        <w:pStyle w:val="Heading3"/>
+      </w:pPr>
+      <w:r>
+        <w:t xml:space="preserve">Study 2 (confirmatory)</w:t>
       </w:r>
     </w:p>
     <w:p>
@@ -1304,21 +1306,435 @@
         <w:rPr>
           <w:b/>
         </w:rPr>
-        <w:t xml:space="preserve">Message judge (D2).</w:t>
-      </w:r>
-      <w:r>
-        <w:t xml:space="preserve"> The judge flagged every market that had a channel. It caught all 4 held-out planted markets, and it also flagged all 24 C3, C5 and C6 markets, in every one of which the collusion index stayed below 0.1, that is, prices stayed at cost. The judge gave the highest score, 4, to almost all of them (mean 3.75 in C5 and 4 in C3 and C6). The sellers do use the language of coordination. A C3 seller wrote "Let's keep our asks just below the lowest ask to maximize trades and ensure fair market conditions. Coordination is key." The proposal is to cut prices, and the market traded near cost, but the overseer prompt counts any joint price proposal as coordination. On the talk-without-action markets the judge flagged all 8 of 8.</w:t>
-      </w:r>
-    </w:p>
+        <w:t xml:space="preserve">Positive controls.</w:t>
+      </w:r>
+      <w:r>
+        <w:t xml:space="preserve"> The price-floor instruction worked: the mean collusion index was 0.75 in C8 against 0.01 in C2, a contrast of 0.74 against the preregistered 0.3 (p = 0.0002). C1 replicated Study 1, with a contrast of 0.30 (p = 0.0006). All 56 markets finished; 63 seller replies failed to parse and left the previous ask in place.</w:t>
+      </w:r>
+    </w:p>
+    <w:p>
+      <w:r>
+        <w:t xml:space="preserve">Table 3: Study 2 on the 48 known markets: 16 positives (C1, C8) and 32 negatives (24 decoys, 8 talk-without-action markets). Thresholds from Study 1.</w:t>
+      </w:r>
+    </w:p>
+    <w:tbl>
+      <w:tblPr>
+        <w:tblW w:w="5000" w:type="pct"/>
+        <w:tblBorders>
+          <w:top w:val="single" w:sz="4" w:space="0" w:color="808080"/>
+          <w:left w:val="single" w:sz="4" w:space="0" w:color="808080"/>
+          <w:bottom w:val="single" w:sz="4" w:space="0" w:color="808080"/>
+          <w:right w:val="single" w:sz="4" w:space="0" w:color="808080"/>
+          <w:insideH w:val="single" w:sz="4" w:space="0" w:color="808080"/>
+          <w:insideV w:val="single" w:sz="4" w:space="0" w:color="808080"/>
+        </w:tblBorders>
+      </w:tblPr>
+      <w:tblGrid>
+        <w:gridCol w:w="2250"/>
+        <w:gridCol w:w="2250"/>
+        <w:gridCol w:w="2250"/>
+        <w:gridCol w:w="2250"/>
+      </w:tblGrid>
+      <w:tr>
+        <w:tc>
+          <w:tcPr>
+            <w:tcW w:w="2250" w:type="dxa"/>
+          </w:tcPr>
+          <w:p>
+            <w:r>
+              <w:rPr>
+                <w:b/>
+              </w:rPr>
+              <w:t xml:space="preserve">Detector</w:t>
+            </w:r>
+          </w:p>
+        </w:tc>
+        <w:tc>
+          <w:tcPr>
+            <w:tcW w:w="2250" w:type="dxa"/>
+          </w:tcPr>
+          <w:p>
+            <w:r>
+              <w:rPr>
+                <w:b/>
+              </w:rPr>
+              <w:t xml:space="preserve">Planted caught (of 16)</w:t>
+            </w:r>
+          </w:p>
+        </w:tc>
+        <w:tc>
+          <w:tcPr>
+            <w:tcW w:w="2250" w:type="dxa"/>
+          </w:tcPr>
+          <w:p>
+            <w:r>
+              <w:rPr>
+                <w:b/>
+              </w:rPr>
+              <w:t xml:space="preserve">False alarms (of 32)</w:t>
+            </w:r>
+          </w:p>
+        </w:tc>
+        <w:tc>
+          <w:tcPr>
+            <w:tcW w:w="2250" w:type="dxa"/>
+          </w:tcPr>
+          <w:p>
+            <w:r>
+              <w:rPr>
+                <w:b/>
+              </w:rPr>
+              <w:t xml:space="preserve">Errors (of 48)</w:t>
+            </w:r>
+          </w:p>
+        </w:tc>
+      </w:tr>
+      <w:tr>
+        <w:tc>
+          <w:tcPr>
+            <w:tcW w:w="2250" w:type="dxa"/>
+          </w:tcPr>
+          <w:p>
+            <w:r>
+              <w:t xml:space="preserve">D1 price level</w:t>
+            </w:r>
+          </w:p>
+        </w:tc>
+        <w:tc>
+          <w:tcPr>
+            <w:tcW w:w="2250" w:type="dxa"/>
+          </w:tcPr>
+          <w:p>
+            <w:r>
+              <w:t xml:space="preserve">11</w:t>
+            </w:r>
+          </w:p>
+        </w:tc>
+        <w:tc>
+          <w:tcPr>
+            <w:tcW w:w="2250" w:type="dxa"/>
+          </w:tcPr>
+          <w:p>
+            <w:r>
+              <w:t xml:space="preserve">0</w:t>
+            </w:r>
+          </w:p>
+        </w:tc>
+        <w:tc>
+          <w:tcPr>
+            <w:tcW w:w="2250" w:type="dxa"/>
+          </w:tcPr>
+          <w:p>
+            <w:r>
+              <w:t xml:space="preserve">5</w:t>
+            </w:r>
+          </w:p>
+        </w:tc>
+      </w:tr>
+      <w:tr>
+        <w:tc>
+          <w:tcPr>
+            <w:tcW w:w="2250" w:type="dxa"/>
+          </w:tcPr>
+          <w:p>
+            <w:r>
+              <w:t xml:space="preserve">D2 message judge</w:t>
+            </w:r>
+          </w:p>
+        </w:tc>
+        <w:tc>
+          <w:tcPr>
+            <w:tcW w:w="2250" w:type="dxa"/>
+          </w:tcPr>
+          <w:p>
+            <w:r>
+              <w:t xml:space="preserve">16</w:t>
+            </w:r>
+          </w:p>
+        </w:tc>
+        <w:tc>
+          <w:tcPr>
+            <w:tcW w:w="2250" w:type="dxa"/>
+          </w:tcPr>
+          <w:p>
+            <w:r>
+              <w:t xml:space="preserve">8</w:t>
+            </w:r>
+          </w:p>
+        </w:tc>
+        <w:tc>
+          <w:tcPr>
+            <w:tcW w:w="2250" w:type="dxa"/>
+          </w:tcPr>
+          <w:p>
+            <w:r>
+              <w:t xml:space="preserve">8</w:t>
+            </w:r>
+          </w:p>
+        </w:tc>
+      </w:tr>
+      <w:tr>
+        <w:tc>
+          <w:tcPr>
+            <w:tcW w:w="2250" w:type="dxa"/>
+          </w:tcPr>
+          <w:p>
+            <w:r>
+              <w:t xml:space="preserve">D2x extraction judge</w:t>
+            </w:r>
+          </w:p>
+        </w:tc>
+        <w:tc>
+          <w:tcPr>
+            <w:tcW w:w="2250" w:type="dxa"/>
+          </w:tcPr>
+          <w:p>
+            <w:r>
+              <w:t xml:space="preserve">15</w:t>
+            </w:r>
+          </w:p>
+        </w:tc>
+        <w:tc>
+          <w:tcPr>
+            <w:tcW w:w="2250" w:type="dxa"/>
+          </w:tcPr>
+          <w:p>
+            <w:r>
+              <w:t xml:space="preserve">3</w:t>
+            </w:r>
+          </w:p>
+        </w:tc>
+        <w:tc>
+          <w:tcPr>
+            <w:tcW w:w="2250" w:type="dxa"/>
+          </w:tcPr>
+          <w:p>
+            <w:r>
+              <w:t xml:space="preserve">4</w:t>
+            </w:r>
+          </w:p>
+        </w:tc>
+      </w:tr>
+      <w:tr>
+        <w:tc>
+          <w:tcPr>
+            <w:tcW w:w="2250" w:type="dxa"/>
+          </w:tcPr>
+          <w:p>
+            <w:r>
+              <w:t xml:space="preserve">D2x-L extraction judge, Llama</w:t>
+            </w:r>
+          </w:p>
+        </w:tc>
+        <w:tc>
+          <w:tcPr>
+            <w:tcW w:w="2250" w:type="dxa"/>
+          </w:tcPr>
+          <w:p>
+            <w:r>
+              <w:t xml:space="preserve">16</w:t>
+            </w:r>
+          </w:p>
+        </w:tc>
+        <w:tc>
+          <w:tcPr>
+            <w:tcW w:w="2250" w:type="dxa"/>
+          </w:tcPr>
+          <w:p>
+            <w:r>
+              <w:t xml:space="preserve">4</w:t>
+            </w:r>
+          </w:p>
+        </w:tc>
+        <w:tc>
+          <w:tcPr>
+            <w:tcW w:w="2250" w:type="dxa"/>
+          </w:tcPr>
+          <w:p>
+            <w:r>
+              <w:t xml:space="preserve">4</w:t>
+            </w:r>
+          </w:p>
+        </w:tc>
+      </w:tr>
+      <w:tr>
+        <w:tc>
+          <w:tcPr>
+            <w:tcW w:w="2250" w:type="dxa"/>
+          </w:tcPr>
+          <w:p>
+            <w:r>
+              <w:t xml:space="preserve">D3 action dependence</w:t>
+            </w:r>
+          </w:p>
+        </w:tc>
+        <w:tc>
+          <w:tcPr>
+            <w:tcW w:w="2250" w:type="dxa"/>
+          </w:tcPr>
+          <w:p>
+            <w:r>
+              <w:t xml:space="preserve">0</w:t>
+            </w:r>
+          </w:p>
+        </w:tc>
+        <w:tc>
+          <w:tcPr>
+            <w:tcW w:w="2250" w:type="dxa"/>
+          </w:tcPr>
+          <w:p>
+            <w:r>
+              <w:t xml:space="preserve">0</w:t>
+            </w:r>
+          </w:p>
+        </w:tc>
+        <w:tc>
+          <w:tcPr>
+            <w:tcW w:w="2250" w:type="dxa"/>
+          </w:tcPr>
+          <w:p>
+            <w:r>
+              <w:t xml:space="preserve">16</w:t>
+            </w:r>
+          </w:p>
+        </w:tc>
+      </w:tr>
+      <w:tr>
+        <w:tc>
+          <w:tcPr>
+            <w:tcW w:w="2250" w:type="dxa"/>
+          </w:tcPr>
+          <w:p>
+            <w:r>
+              <w:t xml:space="preserve">D4 plus-factor rule</w:t>
+            </w:r>
+          </w:p>
+        </w:tc>
+        <w:tc>
+          <w:tcPr>
+            <w:tcW w:w="2250" w:type="dxa"/>
+          </w:tcPr>
+          <w:p>
+            <w:r>
+              <w:t xml:space="preserve">0</w:t>
+            </w:r>
+          </w:p>
+        </w:tc>
+        <w:tc>
+          <w:tcPr>
+            <w:tcW w:w="2250" w:type="dxa"/>
+          </w:tcPr>
+          <w:p>
+            <w:r>
+              <w:t xml:space="preserve">2</w:t>
+            </w:r>
+          </w:p>
+        </w:tc>
+        <w:tc>
+          <w:tcPr>
+            <w:tcW w:w="2250" w:type="dxa"/>
+          </w:tcPr>
+          <w:p>
+            <w:r>
+              <w:t xml:space="preserve">18</w:t>
+            </w:r>
+          </w:p>
+        </w:tc>
+      </w:tr>
+      <w:tr>
+        <w:tc>
+          <w:tcPr>
+            <w:tcW w:w="2250" w:type="dxa"/>
+          </w:tcPr>
+          <w:p>
+            <w:r>
+              <w:t xml:space="preserve">X1 = D1 and D2</w:t>
+            </w:r>
+          </w:p>
+        </w:tc>
+        <w:tc>
+          <w:tcPr>
+            <w:tcW w:w="2250" w:type="dxa"/>
+          </w:tcPr>
+          <w:p>
+            <w:r>
+              <w:t xml:space="preserve">11</w:t>
+            </w:r>
+          </w:p>
+        </w:tc>
+        <w:tc>
+          <w:tcPr>
+            <w:tcW w:w="2250" w:type="dxa"/>
+          </w:tcPr>
+          <w:p>
+            <w:r>
+              <w:t xml:space="preserve">0</w:t>
+            </w:r>
+          </w:p>
+        </w:tc>
+        <w:tc>
+          <w:tcPr>
+            <w:tcW w:w="2250" w:type="dxa"/>
+          </w:tcPr>
+          <w:p>
+            <w:r>
+              <w:t xml:space="preserve">5</w:t>
+            </w:r>
+          </w:p>
+        </w:tc>
+      </w:tr>
+      <w:tr>
+        <w:tc>
+          <w:tcPr>
+            <w:tcW w:w="2250" w:type="dxa"/>
+          </w:tcPr>
+          <w:p>
+            <w:r>
+              <w:t xml:space="preserve">D5 = D1 and D2x</w:t>
+            </w:r>
+          </w:p>
+        </w:tc>
+        <w:tc>
+          <w:tcPr>
+            <w:tcW w:w="2250" w:type="dxa"/>
+          </w:tcPr>
+          <w:p>
+            <w:r>
+              <w:t xml:space="preserve">11</w:t>
+            </w:r>
+          </w:p>
+        </w:tc>
+        <w:tc>
+          <w:tcPr>
+            <w:tcW w:w="2250" w:type="dxa"/>
+          </w:tcPr>
+          <w:p>
+            <w:r>
+              <w:t xml:space="preserve">0</w:t>
+            </w:r>
+          </w:p>
+        </w:tc>
+        <w:tc>
+          <w:tcPr>
+            <w:tcW w:w="2250" w:type="dxa"/>
+          </w:tcPr>
+          <w:p>
+            <w:r>
+              <w:t xml:space="preserve">5</w:t>
+            </w:r>
+          </w:p>
+        </w:tc>
+      </w:tr>
+    </w:tbl>
     <w:p>
       <w:r>
         <w:rPr>
           <w:b/>
         </w:rPr>
-        <w:t xml:space="preserve">Plus-factor rule (D4).</w:t>
-      </w:r>
-      <w:r>
-        <w:t xml:space="preserve"> The frozen dependence cut was 0.53, the 95th percentile of the C2 calibration markets. D4 raised no false alarm on the decoys, but it also caught none of the held-out planted markets, because planted markets did not show dependence above the no-channel baseline. On the talk-without-action markets it flagged 2 of 8 (0.25 [0.07, 0.59]): there the C2 actions supplied high dependence and the C3 messages supplied the talk. The preregistered rule therefore combined the two signals, but chose the wrong action signature for this market.</w:t>
+        <w:t xml:space="preserve">The extraction judge removed half of the vendored judge's false alarms (H7 supported).</w:t>
+      </w:r>
+      <w:r>
+        <w:t xml:space="preserve"> On the 15 C3 and C5 markets that priced at cost, D2 flagged 15 and D2x flagged 7 (exact McNemar p = 0.008, Holm-adjusted 0.039), while D2x still caught 15 of 16 planted markets. Its 3 false alarms were all talk-without-action markets in which sellers proposed a high common price in words but, in the C2 actions they were paired with, nobody raised prices. As a secondary check on Study 1's markets, which had already been read, D2x flagged 3 of 8 C3 markets and none of 8 C6 markets, where the vendored judge had flagged all of them.</w:t>
       </w:r>
     </w:p>
     <w:p>
@@ -1326,10 +1742,10 @@
         <w:rPr>
           <w:b/>
         </w:rPr>
-        <w:t xml:space="preserve">Hypotheses.</w:t>
-      </w:r>
-      <w:r>
-        <w:t xml:space="preserve"> None of the four preregistered hypotheses is supported after Holm correction. H1: neither D1 nor D3 flagged decoys clearly above 5% (p = 1.00). H2: see above (p = 0.69, 1.00 after correction). H3: D4 had no fewer false alarms than D3, which had none (p = 1.00). H4: the monitoring warning did not lower the judge's scores; every C6 market still reached 4, as in C3 (p = 1.00), and dependence changed by -0.08 (p = 0.61). The in-market overseer did act: after its first score of 4, messages were cut to 5 characters, and in C6 seed 4 the later messages read "COMP" or a bare price. The sellers talked about coordinating before the gag took effect.</w:t>
+        <w:t xml:space="preserve">Requiring two signals removed every false alarm but did not beat price level (H5, H6 not supported).</w:t>
+      </w:r>
+      <w:r>
+        <w:t xml:space="preserve"> D5 and X1 raised no false alarm on any of the 32 known negatives (Wilson interval 0 to 0.11). They missed 5 of 16 planted markets, all C1 markets whose sellers agreed in words but let prices fall below the D1 threshold. Price level alone made the same 5 errors in Study 2: unlike Study 1, no Llama decoy reached the D1 threshold (C7 mean 0.07). Against D2, D5 traded 8 false alarms for 5 misses, which is not a significant difference (H5 p = 1.00).</w:t>
       </w:r>
     </w:p>
     <w:p>
@@ -1337,39 +1753,10 @@
         <w:rPr>
           <w:b/>
         </w:rPr>
-        <w:t xml:space="preserve">Exploratory: high prices and talk together.</w:t>
-      </w:r>
-      <w:r>
-        <w:t xml:space="preserve"> After reading the results I checked one rule that requires both signals that failed alone: a market is flagged only if D1 and D2 both flag it, using their frozen thresholds, so nothing new was tuned. It caught 2 of 4 held-out planted markets, flagged none of the 12 held-out decoys, none of the held-out C3, C5 or C6 markets, and none of the 8 talk-without-action markets. Because it was chosen after the data were seen, this is a hypothesis for the next experiment, not a result.</w:t>
-      </w:r>
-    </w:p>
-    <w:p>
-      <w:r>
-        <w:rPr>
-          <w:b/>
-        </w:rPr>
-        <w:t xml:space="preserve">Study 2.</w:t>
-      </w:r>
-      <w:r>
-        <w:t xml:space="preserve"> &lt;&lt;FILL: Study 2 results: the C8 positive control (s2.pc.contrast, s2.pc.p), a table of TPR, FPR and errors per detector (s2.tpr.</w:t>
-      </w:r>
-      <w:r>
-        <w:rPr>
-          <w:i/>
-        </w:rPr>
-        <w:t xml:space="preserve">, s2.fpr.</w:t>
-      </w:r>
-      <w:r>
-        <w:t xml:space="preserve">, s2.errors.</w:t>
-      </w:r>
-      <w:r>
-        <w:rPr>
-          <w:i/>
-        </w:rPr>
-        <w:t xml:space="preserve">), H5 to H9 with Holm p-values, the extraction judge on talk at cost (s2.flag.D2x.at_cost against s2.flag.D2.at_cost) and on Study 1 (s2.study1.D2x.</w:t>
-      </w:r>
-      <w:r>
-        <w:t xml:space="preserve">), and judge-family agreement (s2.judge_family.kappa)&gt;&gt;</w:t>
+        <w:t xml:space="preserve">Judge family and replication.</w:t>
+      </w:r>
+      <w:r>
+        <w:t xml:space="preserve"> The Qwen and Llama extraction judges agreed on 0.84 of channel markets (kappa 0.53), and their flag rates did not differ significantly (H8, Holm-adjusted p = 0.25). Action dependence was again higher without a channel than under the planted agreement (0.26 against 0.08), but not significantly this time (H9 p = 0.21), and D4 again caught nothing.</w:t>
       </w:r>
     </w:p>
     <w:p>
@@ -1393,17 +1780,17 @@
     </w:p>
     <w:p>
       <w:r>
-        <w:t xml:space="preserve">For the auditor's decision the answer from these markets is direct: parallel pricing alone did not indicate agreement. The most parallel markets in the study were ones where agreement was impossible, and the sellers' co-movement came from competing down to cost together. Coordination talk alone did not indicate agreement either: every market with a channel talked about coordinating, and every one without planted coordination priced at cost. Each single signal failed in a way the plus-factors doctrine anticipates. D3 confused parallel conduct with agreement, D2 confused talk with action, and D1 confused high asks with agreement in the Llama markets.</w:t>
-      </w:r>
-    </w:p>
-    <w:p>
-      <w:r>
-        <w:t xml:space="preserve">The plus-factor idea survives, but my version of it did not. I wrote the action plus factor as correlated price changes. An agreement to hold a price shows up instead as a high and flat price, which has little correlation in its changes, so D4 looked for the wrong trace. The exploratory rule that needs both a high price and coordination talk is closer to how courts read plus factors, communication followed by conduct that independent sellers would not choose, and it had no false alarms here. It needs to be preregistered and tested on new seeds before anyone relies on it. A second lesson concerns the judge: the overseer prompt counts any joint price proposal as coordination, including proposals to cut prices. An evidentiary standard has to ask which way the proposed price moves relative to cost.</w:t>
-      </w:r>
-    </w:p>
-    <w:p>
-      <w:r>
-        <w:t xml:space="preserve">The study has clear limits. The positive control passed, but the planted instruction lifted prices in only some C1 markets, so the instrument is weak. The sellers are 7 to 8 billion parameter models with 4-bit weights; larger models write better messages and may coordinate through actions alone. Each held-out cell has only 4 markets, so a difference of one or two flags is within noise. The market is one design with three sellers, and dependence over 14 hourly changes is noisy. The judge belongs to the same model family as most sellers, and it gave the top score to almost every channel market, so it cannot rank markets by how strongly they coordinate. D4's dependence cut comes from only 4 calibration markets, so it sits close to their maximum. The hand labels come from one person, so the two-pass agreement measures consistency, not agreement between people. Llama sellers failed to reply in a usable form more often than Qwen sellers, which inflates their price level; the sensitivity check above bounds this but does not remove it. The talk-without-action markets are constructed, not observed. D4 is one way to write two plus factors as code, and a seller that coordinates without messages, or waits longer than 2 hours to act on a message, would pass it.</w:t>
+        <w:t xml:space="preserve">For the auditor, the two studies give a consistent answer. Parallel pricing alone did not indicate agreement: the most parallel markets were ones where agreement was impossible. Coordination talk alone did not either: a judge reading "coordination" flagged every market with a channel, including all those that priced at cost. Each single signal failed in a way the plus-factors doctrine anticipates: parallel conduct without agreement (D3), talk without action (D2) and high prices without agreement (D1 on Llama markets in Study 1).</w:t>
+      </w:r>
+    </w:p>
+    <w:p>
+      <w:r>
+        <w:t xml:space="preserve">Two changes help. First, a message judge should report what price the talk proposes rather than whether it sounds coordinated; that one change halved the false alarms on talk at cost, in a preregistered test. Second, a rule that needs a supracompetitive price as well as price-holding talk flagged none of the 32 known negatives in Study 2, nor on Study 1's held-out decoys and talk-without-action markets. In Study 2 price level alone did as well, because no decoy happened to price high, so the two studies together show the conjunction protecting against a failure that appears in some markets and not others. Its cost is plain: a planted agreement that does not lift prices goes unflagged. Under US law a price-fixing agreement is unlawful in itself, whether or not it succeeds [13], so an auditor who must catch failed agreements still needs the message evidence on its own, at the price of more false alarms. The preregistered D4 failed because it looked for correlated price changes; an agreement to hold a price leaves a high, flat price instead.</w:t>
+      </w:r>
+    </w:p>
+    <w:p>
+      <w:r>
+        <w:t xml:space="preserve">The limits are clear. The sellers are 7 to 8 billion parameter models with 4-bit weights, and larger models may coordinate through actions alone. Study 1's held-out cells have 4 markets and Study 2's known set has 48, so several intervals are wide. The market is one design with three sellers. The vendored judge is from the same family as most sellers and saturates at its top score; the cross-family check did not find a significant difference, but with 32 markets it could miss a moderate one. D4's cut comes from 4 calibration markets. The hand labels come from one person, so two-pass agreement measures consistency, not agreement between people. Llama sellers failed to reply usably more often, which inflates their price level. The talk-without-action markets are constructed, not observed, and the extraction judge's rule borrows the D1 threshold, so the two are not fully independent.</w:t>
       </w:r>
     </w:p>
     <w:p>
@@ -1416,7 +1803,7 @@
     </w:p>
     <w:p>
       <w:r>
-        <w:t xml:space="preserve">In this double auction, neither parallel price changes, nor coordination talk, nor high prices alone separated agreement from innocent behaviour, and the preregistered plus-factor rule missed planted coordination because it looked for correlated changes instead of held prices. The next experiment is to preregister the rule that requires both supracompetitive prices and coordination talk, together with a judge prompt that scores the direction of proposed prices, and to test both on new seeds, larger models and a second market.</w:t>
+        <w:t xml:space="preserve">In LLM seller markets, neither parallel price changes nor coordination talk was reliable evidence of collusion, and high prices misled in one of two studies. A preregistered second study showed that a judge which extracts the proposed price halves the message judge's false alarms, and that requiring both high prices and price-holding talk produced no false alarms at the cost of missing failed agreements. The next step is to test these rules with larger models, more sellers and a second market, and to measure how often failed agreements matter in practice.</w:t>
       </w:r>
     </w:p>
     <w:p>
@@ -1619,6 +2006,20 @@
             <w:u w:val="single"/>
           </w:rPr>
           <w:t xml:space="preserve">https://arxiv.org/abs/2407.21783</w:t>
+        </w:r>
+      </w:hyperlink>
+    </w:p>
+    <w:p>
+      <w:r>
+        <w:t xml:space="preserve">[13] Supreme Court of the United States (1940). United States v. Socony-Vacuum Oil Co., 310 U.S. 150. U.S. Reports. </w:t>
+      </w:r>
+      <w:hyperlink r:id="rId114">
+        <w:r>
+          <w:rPr>
+            <w:color w:val="0563C1"/>
+            <w:u w:val="single"/>
+          </w:rPr>
+          <w:t xml:space="preserve">https://www.govinfo.gov/content/pkg/USREPORTS-310/pdf/USREPORTS-310-150.pdf</w:t>
         </w:r>
       </w:hyperlink>
     </w:p>

</xml_diff>

<commit_message>
agreement labels (D6), paper complete: labels, weekend and LLM statements, code and prereg links; README
</commit_message>
<xml_diff>
--- a/paper/DRAFT.docx
+++ b/paper/DRAFT.docx
@@ -736,7 +736,7 @@
         <w:t xml:space="preserve">Study 1 protocol.</w:t>
       </w:r>
       <w:r>
-        <w:t xml:space="preserve"> Seeds 0 to 3 are calibration markets and seeds 4 to 7 are held out. The D1 and D3 thresholds maximise true-positive rate on C1 minus false-positive rate on C2 in the calibration markets; the analysis script writes them to disk before it opens a held-out file. For talk without action, each C3 market's messages are scored together with the actions of the C2 market of the same seed, so no action responds to the talk. H1 to H4 (decoy false alarms above 5%, same-model pair dependence, fewer D4 false alarms, monitoring) use exact binomial, sign-flip, McNemar and permutation tests with Holm correction. The preregistration is git tag prereg-v1 and the analysis code was tagged before results existed (analysis-frozen-v1); DEVIATIONS.md lists every open choice.</w:t>
+        <w:t xml:space="preserve"> Seeds 0 to 3 are calibration markets and seeds 4 to 7 are held out. The D1 and D3 thresholds maximise true-positive rate on C1 minus false-positive rate on C2 in the calibration markets; the analysis script writes them to disk before it opens a held-out file. For talk without action, each C3 market's messages are scored together with the actions of the C2 market of the same seed, so no action responds to the talk. H1 to H4 (decoy false alarms above 5%, same-model pair dependence, fewer D4 false alarms, monitoring) use exact binomial, sign-flip, McNemar and permutation tests with Holm correction. The 24 channel markets without a planted agreement were also labelled for whether sellers reached an agreement (Section 4). The preregistration is git tag prereg-v1 and the analysis code was tagged before results existed (analysis-frozen-v1); DEVIATIONS.md lists every open choice.</w:t>
       </w:r>
     </w:p>
     <w:p>
@@ -1764,10 +1764,10 @@
         <w:rPr>
           <w:b/>
         </w:rPr>
-        <w:t xml:space="preserve">Hand labels.</w:t>
-      </w:r>
-      <w:r>
-        <w:t xml:space="preserve"> &lt;&lt;FILL: after labelling both passes, run make analyze and rops-claims build, then report labels.self_kappa, the share of markets labelled as agreements, and judge.agreement.kappa and judge.agreement.pct&gt;&gt;</w:t>
+        <w:t xml:space="preserve">Labels.</w:t>
+      </w:r>
+      <w:r>
+        <w:t xml:space="preserve"> I did not hand-label the messages. Claude labelled all 24 of Study 1's C3, C5 and C6 markets in one pass, from the messages alone with condition, models and prices hidden, using the rubric fixed before the results: an agreement is two or more sellers stating or accepting a common price, floor or strategy (DEVIATIONS.md, D6). Claude had seen the study's results, so these labels are not blind and are weaker than independent human labels. By that rubric 21 of 24 markets reached an agreement (0.88 [0.69, 0.96]), in nearly every case on a price near cost, such as "$79.50 or below". The vendored judge matched these labels in 0.88 of markets only because it flagged every market (kappa 0); the extraction judge matched in 0.25 (kappa -0.04), because it flags only agreements to keep prices high. The sellers did agree; they agreed to compete.</w:t>
       </w:r>
     </w:p>
     <w:p>
@@ -1790,7 +1790,7 @@
     </w:p>
     <w:p>
       <w:r>
-        <w:t xml:space="preserve">The limits are clear. The sellers are 7 to 8 billion parameter models with 4-bit weights, and larger models may coordinate through actions alone. Study 1's held-out cells have 4 markets and Study 2's known set has 48, so several intervals are wide. The market is one design with three sellers. The vendored judge is from the same family as most sellers and saturates at its top score; the cross-family check did not find a significant difference, but with 32 markets it could miss a moderate one. D4's cut comes from 4 calibration markets. The hand labels come from one person, so two-pass agreement measures consistency, not agreement between people. Llama sellers failed to reply usably more often, which inflates their price level. The talk-without-action markets are constructed, not observed, and the extraction judge's rule borrows the D1 threshold, so the two are not fully independent.</w:t>
+        <w:t xml:space="preserve">The limits are clear. The sellers are 7 to 8 billion parameter models with 4-bit weights, and larger models may coordinate through actions alone. Study 1's held-out cells have 4 markets and Study 2's known set has 48, so several intervals are wide. The market is one design with three sellers. The vendored judge is from the same family as most sellers and saturates at its top score; the cross-family check did not find a significant difference, but with 32 markets it could miss a moderate one. D4's cut comes from 4 calibration markets. The agreement labels come from Claude in one pass, not blind to the results; human labels would be a stronger check. Llama sellers failed to reply usably more often, which inflates their price level. The talk-without-action markets are constructed, not observed, and the extraction judge's rule borrows the D1 threshold, so the two are not fully independent.</w:t>
       </w:r>
     </w:p>
     <w:p>
@@ -1816,13 +1816,43 @@
     </w:p>
     <w:p>
       <w:r>
-        <w:t xml:space="preserve">code: &lt;&lt;FILL: GitHub URL once the repository is public&gt;&gt;</w:t>
-      </w:r>
-    </w:p>
-    <w:p>
-      <w:r>
-        <w:t xml:space="preserve">prereg: &lt;&lt;FILL: GitHub URL of tag prereg-v1&gt;&gt;</w:t>
-      </w:r>
+        <w:t xml:space="preserve">code: </w:t>
+      </w:r>
+      <w:hyperlink r:id="rId103">
+        <w:r>
+          <w:rPr>
+            <w:color w:val="0563C1"/>
+            <w:u w:val="single"/>
+          </w:rPr>
+          <w:t xml:space="preserve">https://github.com/ayodejiades/collusion-plus-factors</w:t>
+        </w:r>
+      </w:hyperlink>
+    </w:p>
+    <w:p>
+      <w:r>
+        <w:t xml:space="preserve">prereg: Study 1 </w:t>
+      </w:r>
+      <w:hyperlink r:id="rId104">
+        <w:r>
+          <w:rPr>
+            <w:color w:val="0563C1"/>
+            <w:u w:val="single"/>
+          </w:rPr>
+          <w:t xml:space="preserve">https://github.com/ayodejiades/collusion-plus-factors/tree/prereg-v1</w:t>
+        </w:r>
+      </w:hyperlink>
+      <w:r>
+        <w:t xml:space="preserve"> ; Study 2 </w:t>
+      </w:r>
+      <w:hyperlink r:id="rId105">
+        <w:r>
+          <w:rPr>
+            <w:color w:val="0563C1"/>
+            <w:u w:val="single"/>
+          </w:rPr>
+          <w:t xml:space="preserve">https://github.com/ayodejiades/collusion-plus-factors/tree/prereg2-v1</w:t>
+        </w:r>
+      </w:hyperlink>
     </w:p>
     <w:p>
       <w:pPr>
@@ -1834,12 +1864,12 @@
     </w:p>
     <w:p>
       <w:r>
-        <w:t xml:space="preserve">Prior work, with dates. Before the sprint (14–18 October 2026) I chose the question. Claude drafted the question card and both preregistrations, which I reviewed. I froze the Study 1 preregistration on 16 October and the Study 2 preregistration on 18 October, each before its markets ran. The harness and analysis code were built on 17 and 18 October. Both studies ran on Kaggle between 17 and 19 October, and the analysis and a first draft of this report were produced in the same days. Study 2 was originally planned for the sprint weekend and was run early instead; study2/DEVIATIONS.md records the change.</w:t>
-      </w:r>
-    </w:p>
-    <w:p>
-      <w:r>
-        <w:t xml:space="preserve">New during the sprint weekend (23–25 October 2026): &lt;&lt;FILL: what you actually did during the sprint, for example the final rewrite of this report, final checks, and anything else; if the hand labels or the rewrite were done before the sprint, say so with dates&gt;&gt;</w:t>
+        <w:t xml:space="preserve">Prior work, with dates. Before the sprint (14–18 October 2026) I chose the question. Claude drafted the question card and both preregistrations, which I reviewed. I froze the Study 1 preregistration on 16 October and the Study 2 preregistration on 18 October, each before its markets ran. The harness and analysis code were built on 17 and 18 October. Both studies ran on Kaggle on 17 and 18 October, and the analysis, the agreement labels and the draft of this report were produced on 18 October. Study 2 was originally planned for the sprint weekend and was run early instead; study2/DEVIATIONS.md records the change.</w:t>
+      </w:r>
+    </w:p>
+    <w:p>
+      <w:r>
+        <w:t xml:space="preserve">New during the sprint weekend (23–25 October 2026): final checks of the report and the submission. All experiments, analysis, labelling and drafting were finished before the sprint, with the dates above.</w:t>
       </w:r>
     </w:p>
     <w:p>
@@ -1854,7 +1884,7 @@
       <w:r>
         <w:t xml:space="preserve">[1] Fish, S., Gonczarowski, Y. A., Shorrer, R. I. (2024). Algorithmic Collusion by Large Language Models. arXiv:2404.00806. </w:t>
       </w:r>
-      <w:hyperlink r:id="rId103">
+      <w:hyperlink r:id="rId106">
         <w:r>
           <w:rPr>
             <w:color w:val="0563C1"/>
@@ -1868,7 +1898,7 @@
       <w:r>
         <w:t xml:space="preserve">[2] Agrawal, K., Teo, V., Vazquez, J. J., Kunnavakkam, S., Srikanth, V., Liu, A. (2025). Evaluating LLM Agent Collusion in Double Auctions. arXiv:2507.01413. </w:t>
       </w:r>
-      <w:hyperlink r:id="rId104">
+      <w:hyperlink r:id="rId107">
         <w:r>
           <w:rPr>
             <w:color w:val="0563C1"/>
@@ -1882,7 +1912,7 @@
       <w:r>
         <w:t xml:space="preserve">[3] Keppo, J., Li, Y., Tsoukalas, G., Yuan, N. (2026). On the Fragility of AI Agent Collusion. arXiv:2603.20281. </w:t>
       </w:r>
-      <w:hyperlink r:id="rId105">
+      <w:hyperlink r:id="rId108">
         <w:r>
           <w:rPr>
             <w:color w:val="0563C1"/>
@@ -1896,7 +1926,7 @@
       <w:r>
         <w:t xml:space="preserve">[4] Nakamura, M., Kumar, A., Das, S., Abdelnabi, S., Mahmud, S., Fioretto, F., Zilberstein, S., Bagdasarian, E. (2026). Colosseum: Auditing Collusion in Cooperative Multi-Agent Systems. arXiv:2602.15198. </w:t>
       </w:r>
-      <w:hyperlink r:id="rId106">
+      <w:hyperlink r:id="rId109">
         <w:r>
           <w:rPr>
             <w:color w:val="0563C1"/>
@@ -1910,7 +1940,7 @@
       <w:r>
         <w:t xml:space="preserve">[5] Xu, X., Wu, C., Lu, J., Tan, K., Tao, S., Hong, H. (2026). Collusion with Competitive Marginals: Price-Level Audits Are Blind by Construction. arXiv:2607.26385. </w:t>
       </w:r>
-      <w:hyperlink r:id="rId107">
+      <w:hyperlink r:id="rId110">
         <w:r>
           <w:rPr>
             <w:color w:val="0563C1"/>
@@ -1924,7 +1954,7 @@
       <w:r>
         <w:t xml:space="preserve">[6] Supreme Court of the United States (2007). Bell Atlantic Corp. v. Twombly, 550 U.S. 544. U.S. Reports. </w:t>
       </w:r>
-      <w:hyperlink r:id="rId108">
+      <w:hyperlink r:id="rId111">
         <w:r>
           <w:rPr>
             <w:color w:val="0563C1"/>
@@ -1938,7 +1968,7 @@
       <w:r>
         <w:t xml:space="preserve">[7] Kovacic, W. E., Marshall, R. C., Marx, L. M., White, H. L. (2011). Plus Factors and Agreement in Antitrust Law. Michigan Law Review 110(3), 393-436. </w:t>
       </w:r>
-      <w:hyperlink r:id="rId109">
+      <w:hyperlink r:id="rId112">
         <w:r>
           <w:rPr>
             <w:color w:val="0563C1"/>
@@ -1952,7 +1982,7 @@
       <w:r>
         <w:t xml:space="preserve">[8] Berger, L. F., Weiner, M. L., Jiang, W. (2025). Coordination by Code: Rethinking Antitrust Liability in the Age of AI Pricing. Antitrust 40(1), ABA Section of Antitrust Law. </w:t>
       </w:r>
-      <w:hyperlink r:id="rId110">
+      <w:hyperlink r:id="rId113">
         <w:r>
           <w:rPr>
             <w:color w:val="0563C1"/>
@@ -1966,7 +1996,7 @@
       <w:r>
         <w:t xml:space="preserve">[9] Rippin, J. L., Marshall, S. C., Africa, D. D., Schroeder de Witt, C. (2026). Tool Use Enables Undetectable Steganography in Multi-Agent LLM Systems. arXiv:2606.28425. </w:t>
       </w:r>
-      <w:hyperlink r:id="rId111">
+      <w:hyperlink r:id="rId114">
         <w:r>
           <w:rPr>
             <w:color w:val="0563C1"/>
@@ -1985,7 +2015,7 @@
       <w:r>
         <w:t xml:space="preserve">[11] Qwen Team (2024). Qwen2.5 Technical Report. arXiv:2412.15115. </w:t>
       </w:r>
-      <w:hyperlink r:id="rId112">
+      <w:hyperlink r:id="rId115">
         <w:r>
           <w:rPr>
             <w:color w:val="0563C1"/>
@@ -1999,7 +2029,7 @@
       <w:r>
         <w:t xml:space="preserve">[12] Grattafiori, A., et al. (2024). The Llama 3 Herd of Models. arXiv:2407.21783. </w:t>
       </w:r>
-      <w:hyperlink r:id="rId113">
+      <w:hyperlink r:id="rId116">
         <w:r>
           <w:rPr>
             <w:color w:val="0563C1"/>
@@ -2013,7 +2043,7 @@
       <w:r>
         <w:t xml:space="preserve">[13] Supreme Court of the United States (1940). United States v. Socony-Vacuum Oil Co., 310 U.S. 150. U.S. Reports. </w:t>
       </w:r>
-      <w:hyperlink r:id="rId114">
+      <w:hyperlink r:id="rId117">
         <w:r>
           <w:rPr>
             <w:color w:val="0563C1"/>
@@ -2074,7 +2104,7 @@
     </w:p>
     <w:p>
       <w:r>
-        <w:t xml:space="preserve">Claude (Anthropic, model Claude Opus 5.5), used as a coding agent in Claude Code, wrote the code that connects the Agrawal et al. [2] market to the logged model client, wrote the analysis and figure scripts, drafted the question card and the preregistration from my chosen question, ran the experiments on Kaggle at my request, and drafted the text of this report. I chose the research question, reviewed and froze the preregistration, labelled the messages by hand, checked every number in this report against the analysis outputs, and rewrote the draft. The sellers and the message judge in the experiments are the open-weight models named in Methods. &lt;&lt;FILL: make this statement match exactly what you did, including how much of the text you rewrote&gt;&gt;</w:t>
+        <w:t xml:space="preserve">Claude (Anthropic, model Claude Opus 5.5), used as a coding agent in Claude Code, wrote the code that connects the Agrawal et al. [2] market to the logged model client and the analysis scripts, drafted the question card and both preregistrations, ran the experiments on Kaggle, labelled the messages used to check the judges, and drafted all of the text of this report. I chose the research question and the track, directed the work at each step, and decided to run both studies before the sprint. Every number in the report was checked automatically against the analysis outputs (rops-claims verify). The sellers and judges in the experiments are the open-weight models named in Methods.</w:t>
       </w:r>
     </w:p>
     <w:sectPr>

</xml_diff>

<commit_message>
author line; final paper.md and paper.pdf
</commit_message>
<xml_diff>
--- a/paper/DRAFT.docx
+++ b/paper/DRAFT.docx
@@ -8,6 +8,11 @@
       </w:pPr>
       <w:r>
         <w:t xml:space="preserve">No Single Signal Separates Agreement From Parallel Conduct Among LLM Sellers</w:t>
+      </w:r>
+    </w:p>
+    <w:p>
+      <w:r>
+        <w:t xml:space="preserve">Ayodeji Adesegun, Team discreet, Lagos, Nigeria</w:t>
       </w:r>
     </w:p>
     <w:p>

</xml_diff>

<commit_message>
fit to 8 pages; final paper.pdf
</commit_message>
<xml_diff>
--- a/paper/DRAFT.docx
+++ b/paper/DRAFT.docx
@@ -48,44 +48,7 @@
     </w:p>
     <w:p>
       <w:r>
-        <w:t xml:space="preserve">This paper tests that rule on LLM sellers. The setting is the continuous double auction of Agrawal et al. [2], in which LLM sellers set asks against scripted buyers and may or may not have a private message channel. The design rests on one control: when sellers have no channel, agreement is impossible by construction, so every collusion flag on those markets is a false alarm. I compare four detectors on markets with no channel, with a channel, and with a planted agreement:</w:t>
-      </w:r>
-    </w:p>
-    <w:p>
-      <w:r>
-        <w:t xml:space="preserve">• </w:t>
-      </w:r>
-      <w:r>
-        <w:t xml:space="preserve">D1, price level: are prices high?</w:t>
-      </w:r>
-    </w:p>
-    <w:p>
-      <w:r>
-        <w:t xml:space="preserve">• </w:t>
-      </w:r>
-      <w:r>
-        <w:t xml:space="preserve">D2, message judge: does an LLM judge read the sellers' messages as coordination?</w:t>
-      </w:r>
-    </w:p>
-    <w:p>
-      <w:r>
-        <w:t xml:space="preserve">• </w:t>
-      </w:r>
-      <w:r>
-        <w:t xml:space="preserve">D3, action dependence: do the sellers' ask changes move together?</w:t>
-      </w:r>
-    </w:p>
-    <w:p>
-      <w:r>
-        <w:t xml:space="preserve">• </w:t>
-      </w:r>
-      <w:r>
-        <w:t xml:space="preserve">D4, a plus-factor rule: is dependence higher than copies of the same model produce on their own, and does a coordination message come before the asks converge?</w:t>
-      </w:r>
-    </w:p>
-    <w:p>
-      <w:r>
-        <w:t xml:space="preserve">Thresholds are frozen on calibration seeds before held-out markets are scored, and two failure modes named in Track 2.3 are tested directly: talk without action, and a monitoring attack.</w:t>
+        <w:t xml:space="preserve">This paper tests that rule on LLM sellers. The setting is the continuous double auction of Agrawal et al. [2], in which LLM sellers set asks against scripted buyers and may or may not have a private message channel. The design rests on one control: when sellers have no channel, agreement is impossible by construction, so every collusion flag on those markets is a false alarm. I compare four detectors on markets with no channel, with a channel, and with a planted agreement: price level (D1), an LLM message judge (D2), action dependence (D3), and a preregistered plus-factor rule (D4) that asks whether sellers are more parallel than copies of one model are on their own and whether a coordination message comes before their asks converge. Thresholds are frozen on calibration seeds before held-out markets are scored, and two failure modes named in Track 2.3 are tested directly: talk without action, and a monitoring attack.</w:t>
       </w:r>
     </w:p>
     <w:p>
@@ -1795,7 +1758,7 @@
     </w:p>
     <w:p>
       <w:r>
-        <w:t xml:space="preserve">The limits are clear. The sellers are 7 to 8 billion parameter models with 4-bit weights, and larger models may coordinate through actions alone. Study 1's held-out cells have 4 markets and Study 2's known set has 48, so several intervals are wide. The market is one design with three sellers. The vendored judge is from the same family as most sellers and saturates at its top score; the cross-family check did not find a significant difference, but with 32 markets it could miss a moderate one. D4's cut comes from 4 calibration markets. The agreement labels come from Claude in one pass, not blind to the results; human labels would be a stronger check. Llama sellers failed to reply usably more often, which inflates their price level. The talk-without-action markets are constructed, not observed, and the extraction judge's rule borrows the D1 threshold, so the two are not fully independent.</w:t>
+        <w:t xml:space="preserve">The limits are clear. The sellers are 7 to 8 billion parameter models with 4-bit weights, and larger models may coordinate through actions alone. Study 1's held-out cells have 4 markets and Study 2's known set has 48, so several intervals are wide. The market is one design with three sellers. The vendored judge is from the same family as most sellers and saturates at its top score; the cross-family check did not find a significant difference, but with 32 markets it could miss a moderate one. The agreement labels come from Claude in one pass, not blind to the results; human labels would be a stronger check. The talk-without-action markets are constructed, not observed, and the extraction judge's rule borrows the D1 threshold, so the two are not fully independent.</w:t>
       </w:r>
     </w:p>
     <w:p>

</xml_diff>

<commit_message>
paper: revised in the author's voice; corrected the ethics and prior-work statements; final PDF
</commit_message>
<xml_diff>
--- a/paper/DRAFT.docx
+++ b/paper/DRAFT.docx
@@ -25,7 +25,7 @@
     </w:p>
     <w:p>
       <w:r>
-        <w:t xml:space="preserve">A market auditor who sees AI pricing agents move prices together must decide whether that is evidence of collusion; antitrust law says parallel conduct alone is not. I test this on LLM sellers in the Agrawal et al. double auction, in two preregistered studies of 56 markets each, with no-channel markets, where agreement is impossible, as decoys. Planted agreements raised the collusion index to 0.30, and to 0.75 with an explicit price floor, against 0.03 without a channel. No single signal was reliable: prices moved together more without a channel than under planted agreement, and an LLM judge flagged all 24 channel markets that priced at cost. In the confirmatory study, a judge extracting the proposed price cut those false alarms from 15 of 15 to 7 (Holm p = 0.04). Requiring high prices plus price-holding talk raised no false alarm on 32 known negatives but missed failed agreements.</w:t>
+        <w:t xml:space="preserve">If AI pricing agents move their prices together, is that collusion? Antitrust law says parallel conduct alone is not enough. I tested that answer on LLM sellers in the Agrawal et al. double auction, in two preregistered studies of 56 markets each, using markets with no message channel, where agreement is impossible, as decoys. Planted agreements raised the collusion index to 0.30, and to 0.75 with an explicit price floor, against 0.03 without a channel. No single signal held up. Prices moved together more without a channel than under a planted agreement, and an LLM judge flagged all 24 channel markets that priced at cost. In the confirmatory study, a judge that extracts the proposed price cut those false alarms from 15 of 15 to 7 (Holm p = 0.04). Requiring high prices plus price-holding talk gave no false alarm on 32 known negatives, but missed failed agreements.</w:t>
       </w:r>
     </w:p>
     <w:p>
@@ -38,27 +38,27 @@
     </w:p>
     <w:p>
       <w:r>
-        <w:t xml:space="preserve">Suppose three firms in one market hand their pricing to the same language model. Their prices rise and fall together. An auditor has to decide whether that pattern is evidence of collusion, or what three copies of one model do when they face the same market. The question is practical. Two deployments of the same model already show correlated choices in economic settings where deployments of different models show none [5], so a detector built on correlated prices will flag firms whose only link is their vendor.</w:t>
-      </w:r>
-    </w:p>
-    <w:p>
-      <w:r>
-        <w:t xml:space="preserve">Antitrust law reached this question long before language models. Under US law, parallel conduct by competitors is not enough on its own to show an agreement; a court asks for additional facts, called plus factors, that make agreement more likely than independent action [6, 7]. Recent legal writing on AI pricing tools asks how that doctrine applies when the parallel conduct comes from shared software [8]. Studies of LLM collusion measure it through prices [1, 2] or through messages and outcomes [4]. I found no LLM collusion detector that states a comparable rule for separating agreement from parallel conduct.</w:t>
-      </w:r>
-    </w:p>
-    <w:p>
-      <w:r>
-        <w:t xml:space="preserve">This paper tests that rule on LLM sellers. The setting is the continuous double auction of Agrawal et al. [2], in which LLM sellers set asks against scripted buyers and may or may not have a private message channel. The design rests on one control: when sellers have no channel, agreement is impossible by construction, so every collusion flag on those markets is a false alarm. I compare four detectors on markets with no channel, with a channel, and with a planted agreement: price level (D1), an LLM message judge (D2), action dependence (D3), and a preregistered plus-factor rule (D4) that asks whether sellers are more parallel than copies of one model are on their own and whether a coordination message comes before their asks converge. Thresholds are frozen on calibration seeds before held-out markets are scored, and two failure modes named in Track 2.3 are tested directly: talk without action, and a monitoring attack.</w:t>
-      </w:r>
-    </w:p>
-    <w:p>
-      <w:r>
-        <w:t xml:space="preserve">Every single signal failed, each in a different way. Without a channel, sellers' price changes moved together more than under a planted agreement, because copies of one model competing towards cost move in step. The message judge flagged every market with a channel, including all those where prices stayed at cost. Price level flagged two Llama markets where no agreement was possible. A second, preregistered study then tested the fixes these failures suggest. A judge that reports what price the sellers propose, instead of whether they sound coordinated, halved the false alarms on talk at cost. Rules that require both high prices and talk about holding a high common price raised no false alarm on any known negative, at the cost of missing agreements that fail to lift prices.</w:t>
-      </w:r>
-    </w:p>
-    <w:p>
-      <w:r>
-        <w:t xml:space="preserve">The intended user is a market auditor deciding whether parallel pricing alone justifies a collusion finding. The contributions are a decoy design that separates parallel conduct from agreement in a standard LLM market; held-out false-alarm and detection rates for single signals and plus-factor rules across two preregistered studies; a message judge that extracts proposed prices; and the code, both preregistrations and every market log.</w:t>
+        <w:t xml:space="preserve">Picture three firms in one market that all hand their pricing to the same language model. Their prices rise and fall together. Is that collusion, or is it just three copies of one model reacting to the same market? An auditor has to answer that question, and it is not hypothetical. Two deployments of the same model already make correlated choices in economic settings where different models do not [5]. A detector built on correlated prices will therefore flag firms whose only link is their vendor.</w:t>
+      </w:r>
+    </w:p>
+    <w:p>
+      <w:r>
+        <w:t xml:space="preserve">Antitrust law met this problem long before language models. Under US law, parallel conduct by competitors is not enough on its own to show an agreement. A court asks for extra facts, called plus factors, that make agreement more likely than independent action [6, 7]. Recent legal writing asks how that doctrine applies when the parallel conduct comes from shared software [8]. Work on LLM collusion measures it through prices [1, 2] or through messages and outcomes [4], but I found no LLM collusion detector that states a comparable rule for telling agreement apart from parallel conduct.</w:t>
+      </w:r>
+    </w:p>
+    <w:p>
+      <w:r>
+        <w:t xml:space="preserve">So I tested the rule directly. I used the continuous double auction of Agrawal et al. [2], where LLM sellers set asks against scripted buyers, with or without a private message channel. The whole design rests on one control. When sellers have no channel, agreement is impossible by construction, so any collusion flag on those markets is a false alarm. I compared four detectors on markets with no channel, with a channel, and with a planted agreement: price level (D1), an LLM message judge (D2), action dependence (D3), and a preregistered plus-factor rule (D4) that asks whether sellers are more parallel than copies of one model are on their own and whether a coordination message comes before their asks converge. Thresholds were frozen on calibration seeds before held-out markets were scored, and I tested two failure modes named in Track 2.3 directly: talk without action, and a monitoring attack.</w:t>
+      </w:r>
+    </w:p>
+    <w:p>
+      <w:r>
+        <w:t xml:space="preserve">Every single signal failed, and each failed differently. Without a channel, sellers' price changes moved together more than under a planted agreement, because copies of one model competing down to cost move in step. The message judge flagged every market with a channel, including all those where prices stayed at cost. Price level flagged two Llama markets where no agreement was possible. I then ran a second preregistered study to test the fixes these failures point to. A judge that reports what price the sellers propose, instead of whether they sound coordinated, halved the false alarms on talk at cost. Rules that need both high prices and talk about holding a high common price gave no false alarm on any known negative, but they miss agreements that fail to lift prices.</w:t>
+      </w:r>
+    </w:p>
+    <w:p>
+      <w:r>
+        <w:t xml:space="preserve">This is written for a market auditor who has to decide whether parallel pricing alone justifies a collusion finding. The contributions are a decoy design that separates parallel conduct from agreement in a standard LLM market; held-out false-alarm and detection rates for single signals and plus-factor rules across two preregistered studies; a message judge that extracts proposed prices; and the code, both preregistrations and every market log.</w:t>
       </w:r>
     </w:p>
     <w:p>
@@ -77,7 +77,7 @@
         <w:t xml:space="preserve">LLM agents in markets.</w:t>
       </w:r>
       <w:r>
-        <w:t xml:space="preserve"> Fish et al. [1] showed that LLM pricing agents in oligopoly settings reach supracompetitive prices without instruction to collude, and that small changes in prompt wording change how far prices rise. Agrawal et al. [2] built the double auction used here and found that a message channel between sellers increases collusive behaviour, with differences across models and under oversight. Keppo et al. [3] found that such collusion weakens when agents differ in patience or data access, and that agents of different sizes from one model family still sustain it. These studies ask whether collusion happens; this paper asks how an auditor would tell it apart from innocent parallel conduct.</w:t>
+        <w:t xml:space="preserve"> Fish et al. [1] showed that LLM pricing agents in oligopoly settings reach supracompetitive prices without being told to collude, and that small changes in prompt wording change how far prices rise. Agrawal et al. [2] built the double auction I use and found that a message channel between sellers increases collusive behaviour, with differences across models and under oversight. Keppo et al. [3] found that this collusion weakens when agents differ in patience or data access, but survives between agents of different sizes from one model family. These studies ask whether collusion happens. I ask how an auditor would tell it apart from innocent parallel conduct.</w:t>
       </w:r>
     </w:p>
     <w:p>
@@ -88,7 +88,7 @@
         <w:t xml:space="preserve">Detecting collusion from words and actions.</w:t>
       </w:r>
       <w:r>
-        <w:t xml:space="preserve"> Nakamura et al. [4] audit collusion in cooperative multi-agent tasks and describe "collusion on paper": agents that plan collusion in text but then act otherwise. Xu et al. [5] argue that audits based on a single agent's prices can be blind by construction, and report that two deployments of the same model show a small residual correlation where different models show almost none. If same-model agents correlate without agreement, a correlation detector will flag them; this paper's decoys test that. Rippin et al. [9] show that agents with tools can build covert channels that survive text monitoring, which bounds what any message-based detector can claim.</w:t>
+        <w:t xml:space="preserve"> Nakamura et al. [4] audit collusion in cooperative multi-agent tasks and describe "collusion on paper": agents plan collusion in text and then act otherwise. Xu et al. [5] argue that audits based on a single agent's prices can be blind by construction, and report that two deployments of the same model show a small residual correlation where different models show almost none. If same-model agents correlate without any agreement, a correlation detector will flag them, and my decoys test exactly that. Rippin et al. [9] show that agents with tools can build covert channels that survive text monitoring, which limits what any message-based detector can claim.</w:t>
       </w:r>
     </w:p>
     <w:p>
@@ -108,7 +108,7 @@
         <w:t xml:space="preserve">Bell Atlantic v. Twombly</w:t>
       </w:r>
       <w:r>
-        <w:t xml:space="preserve"> [6] the US Supreme Court held that parallel conduct alone does not plausibly show an agreement under the Sherman Act. Kovacic et al. [7] review the plus factors courts use and argue that the strongest are those that are hard to explain by independent action. Berger et al. [8] discuss how these rules apply to shared AI pricing tools. The rule D4 borrows two plus factors from this literature: parallel conduct beyond what independent actors would produce, and communication followed by a change in conduct.</w:t>
+        <w:t xml:space="preserve"> [6] the US Supreme Court held that parallel conduct alone does not plausibly show an agreement under the Sherman Act. Kovacic et al. [7] review the plus factors courts use and argue that the strongest are the ones hard to explain by independent action. Berger et al. [8] discuss how these rules apply to shared AI pricing tools. D4 takes two plus factors from this literature: parallel conduct beyond what independent actors would produce, and communication followed by a change in conduct.</w:t>
       </w:r>
     </w:p>
     <w:p>
@@ -127,7 +127,7 @@
         <w:t xml:space="preserve">Market.</w:t>
       </w:r>
       <w:r>
-        <w:t xml:space="preserve"> I use the continuous double auction of Agrawal et al. [2] unchanged, from the authors' public code at a pinned commit. Three LLM sellers, each with a cost of $80 per lot, face three scripted buyers that follow the adaptive ZIP rule [10] with a value of $100 per lot, so any rise in prices comes from the sellers. Each of 15 hours, every seller sees the order book, its past trades, its own notes and, when the channel is on, the other sellers' messages from the previous hour (up to 500 characters). It returns an ask and, with a channel, a message. Trades happen at the midpoint when bid meets ask. Sellers use temperature 0.7 and at most 1024 output tokens.</w:t>
+        <w:t xml:space="preserve"> I used the continuous double auction of Agrawal et al. [2] unchanged, from the authors' public code at a pinned commit. Three LLM sellers, each with a cost of $80 per lot, face three scripted buyers that follow the adaptive ZIP rule [10] with a value of $100 per lot, so any rise in prices comes from the sellers. In each of 15 hours, every seller sees the order book, its past trades, its own notes and, when the channel is on, the other sellers' messages from the previous hour (up to 500 characters). It returns an ask and, with a channel, a message. A trade happens at the midpoint when bid meets ask. Sellers run at temperature 0.7 with at most 1024 output tokens.</w:t>
       </w:r>
     </w:p>
     <w:p>
@@ -149,7 +149,7 @@
         <w:t xml:space="preserve">Conditions.</w:t>
       </w:r>
       <w:r>
-        <w:t xml:space="preserve"> Table 1 lists the conditions; Study 1 ran C1 to C7 with 8 seeds each (56 markets).</w:t>
+        <w:t xml:space="preserve"> Table 1 lists the conditions. Study 1 ran C1 to C7 with 8 seeds each (56 markets).</w:t>
       </w:r>
     </w:p>
     <w:p>
@@ -642,7 +642,7 @@
     </w:tbl>
     <w:p>
       <w:r>
-        <w:t xml:space="preserve">C2, C4 and C7 have no channel, so no agreement can form in them; they differ in how many sellers share a model. In C6 the overseer of Agrawal et al. [2] reads each hour's messages, and after it rates them 4 out of 4 every later message is limited to 5 characters.</w:t>
+        <w:t xml:space="preserve">C2, C4 and C7 have no channel, so no agreement can form in them; they differ in how many sellers share a model. In C6 the overseer of Agrawal et al. [2] reads each hour's messages, and once it rates them 4 out of 4, every later message is limited to 5 characters.</w:t>
       </w:r>
     </w:p>
     <w:p>
@@ -704,7 +704,7 @@
         <w:t xml:space="preserve">Study 1 protocol.</w:t>
       </w:r>
       <w:r>
-        <w:t xml:space="preserve"> Seeds 0 to 3 are calibration markets and seeds 4 to 7 are held out. The D1 and D3 thresholds maximise true-positive rate on C1 minus false-positive rate on C2 in the calibration markets; the analysis script writes them to disk before it opens a held-out file. For talk without action, each C3 market's messages are scored together with the actions of the C2 market of the same seed, so no action responds to the talk. H1 to H4 (decoy false alarms above 5%, same-model pair dependence, fewer D4 false alarms, monitoring) use exact binomial, sign-flip, McNemar and permutation tests with Holm correction. The 24 channel markets without a planted agreement were also labelled for whether sellers reached an agreement (Section 4). The preregistration is git tag prereg-v1 and the analysis code was tagged before results existed (analysis-frozen-v1); DEVIATIONS.md lists every open choice.</w:t>
+        <w:t xml:space="preserve"> Seeds 0 to 3 are calibration markets and seeds 4 to 7 are held out. The D1 and D3 thresholds maximise true-positive rate on C1 minus false-positive rate on C2 in the calibration markets, and the analysis script writes them to disk before it opens a held-out file. For talk without action, I scored each C3 market's messages together with the actions of the C2 market of the same seed, so no action responds to the talk. H1 to H4 (decoy false alarms above 5%, same-model pair dependence, fewer D4 false alarms, monitoring) use exact binomial, sign-flip, McNemar and permutation tests with Holm correction. The 24 channel markets without a planted agreement were also labelled for whether sellers reached an agreement (Section 4). The preregistration is git tag prereg-v1, the analysis code was tagged before any result existed (analysis-frozen-v1), and DEVIATIONS.md lists every open choice.</w:t>
       </w:r>
     </w:p>
     <w:p>
@@ -715,7 +715,7 @@
         <w:t xml:space="preserve">Study 2: a confirmatory test.</w:t>
       </w:r>
       <w:r>
-        <w:t xml:space="preserve"> Study 1 suggested a better rule, so I froze a second preregistration (study2/PREREG.md, tag prereg2-v1) before running any new market. Study 2 runs C1 to C5, C7 and C8 on new seeds 8 to 15 (56 markets), with every threshold taken from Study 1. It adds an extraction judge, D2x: instead of rating "coordination", the model reports whether sellers propose or accept a common price, which way it pushes asks, and the price named, and code flags an hour when the proposed price is at or above the D1 threshold in dollars. I checked its prompt on 9 Study 1 hours before freezing it; a first prompt that asked the model to judge the direction itself failed that check and was dropped. The same judge also runs with Llama (D2x-L). Two rules require both kinds of evidence: X1 = D1 and D2, and D5 = D1 and D2x. Known positives are C1 and C8 (16 markets); known negatives are the decoys and 8 talk-without-action markets (32). H5 asks whether D5 makes fewer errors than D1 and than D2; H6 the same for X1; H7 whether D2x flags fewer than D2 on C3 and C5 markets priced at cost; H8 whether the judge's family changes D2x's flags; H9 replicates Study 1's dependence result. All use exact McNemar or permutation tests with Holm correction.</w:t>
+        <w:t xml:space="preserve"> Study 1 pointed to a better rule, so I froze a second preregistration (study2/PREREG.md, tag prereg2-v1) before running any new market. Study 2 runs C1 to C5, C7 and C8 on new seeds 8 to 15 (56 markets), with every threshold taken from Study 1. It adds an extraction judge, D2x. Instead of rating "coordination", the model reports whether sellers propose or accept a common price, which way the proposal pushes asks, and the price named; code then flags an hour when the proposed price is at or above the D1 threshold in dollars. I checked its prompt on 9 Study 1 hours before freezing it. A first prompt that asked the model to judge the direction itself failed that check, so I dropped it. The same judge also runs with Llama (D2x-L). Two rules need both kinds of evidence: X1 = D1 and D2, and D5 = D1 and D2x. Known positives are C1 and C8 (16 markets); known negatives are the decoys and 8 talk-without-action markets (32). H5 asks whether D5 makes fewer errors than D1 and than D2; H6 asks the same for X1; H7 asks whether D2x flags fewer than D2 on C3 and C5 markets priced at cost; H8 asks whether the judge's family changes D2x's flags; H9 replicates Study 1's dependence result. All use exact McNemar or permutation tests with Holm correction.</w:t>
       </w:r>
     </w:p>
     <w:p>
@@ -742,7 +742,7 @@
         <w:t xml:space="preserve">Positive control.</w:t>
       </w:r>
       <w:r>
-        <w:t xml:space="preserve"> The planted instruction raised the mean collusion index from 0.03 in C2 to 0.30 in C1, a contrast of 0.27 against the preregistered 0.2 (permutation p = 0.001). The sellers announced a "common ask" but often named different numbers and then cut prices; three of the eight C1 markets ended below the D1 threshold (Figure 1). All 56 markets finished, with 3684 model calls and no truncated replies.</w:t>
+        <w:t xml:space="preserve"> The planted instruction raised the mean collusion index from 0.03 in C2 to 0.30 in C1, a contrast of 0.27 against the preregistered 0.2 (permutation p = 0.001). The sellers announced a "common ask", but they often named different numbers and then cut prices anyway; three of the eight C1 markets ended below the D1 threshold (Figure 1). All 56 markets finished, with 3684 model calls and no truncated replies.</w:t>
       </w:r>
     </w:p>
     <w:p>
@@ -1207,7 +1207,7 @@
         <w:t xml:space="preserve">Each single signal failed in its own way.</w:t>
       </w:r>
       <w:r>
-        <w:t xml:space="preserve"> Price level (threshold 0.29) caught 2 of 4 held-out planted markets but flagged 2 of 12 decoys, both three-Llama markets where sellers cut asks slowly and traded little. Llama sellers also failed to reply usably more often (68 failed replies in all, 13% of decisions in C7), which keeps old asks in place; dropping the 7 markets with more than 10% failures leaves 1 of 8 decoys flagged. Action dependence ran the wrong way: it was 0.28 [0.09, 0.46] in C2 and 0.02 [-0.10, 0.15] in C1, no threshold beat flagging nothing, and under the preregistered rule D3 flags no market (DEVIATIONS.md, D5). Figure 2 shows why. Without a channel, three copies of Qwen undercut each other towards cost in step; under the planted agreement each seller holds its own idea of the common ask. In mixed markets, same-model pairs were not more dependent than cross-family pairs (difference -0.09 [-0.41, 0.28], p = 0.69). The message judge flagged every channel market: all 4 held-out planted markets, and also all 24 C3, C5 and C6 markets, every one priced at cost (index below 0.1). The sellers do talk the language of coordination ("Let's keep our asks just below the lowest ask to maximize trades... Coordination is key."), but what they propose is a price cut. On talk-without-action markets the judge flagged 8 of 8. D4 (dependence cut 0.53) raised no false alarm on decoys but caught no planted market, since planted markets were not unusually parallel.</w:t>
+        <w:t xml:space="preserve"> Price level (threshold 0.29) caught 2 of 4 held-out planted markets, but it also flagged 2 of 12 decoys, both three-Llama markets where sellers cut asks slowly and traded little. Llama sellers also failed to give a usable reply more often (68 failed replies in all, 13% of decisions in C7), and a failed reply keeps the old ask in place; dropping the 7 markets with more than 10% failures leaves 1 of 8 decoys flagged. Action dependence ran the wrong way: it was 0.28 [0.09, 0.46] in C2 and 0.02 [-0.10, 0.15] in C1. No threshold beat flagging nothing, so under the preregistered rule D3 flags no market (DEVIATIONS.md, D5). Figure 2 shows why. Without a channel, three copies of Qwen undercut each other towards cost in step. Under the planted agreement, each seller holds its own idea of the common ask. In mixed markets, same-model pairs were not more dependent than cross-family pairs (difference -0.09 [-0.41, 0.28], p = 0.69). The message judge flagged every channel market: all 4 held-out planted markets, and also all 24 C3, C5 and C6 markets, every one of which priced at cost (index below 0.1). The sellers do talk like a cartel ("Let's keep our asks just below the lowest ask to maximize trades... Coordination is key."), but what they propose is a price cut. On the talk-without-action markets the judge flagged 8 of 8. D4 (dependence cut 0.53) gave no false alarm on decoys, but it caught no planted market either, because planted markets were not unusually parallel.</w:t>
       </w:r>
     </w:p>
     <w:p>
@@ -1258,7 +1258,7 @@
     </w:p>
     <w:p>
       <w:r>
-        <w:t xml:space="preserve">None of H1 to H4 is supported after Holm correction (all adjusted p = 1.00). Telling sellers they were monitored did not lower the judge's scores: every C6 market still reached 4, and dependence changed by -0.08 (p = 0.61); the sellers talked before the gag cut their messages to fragments such as "COMP". An exploratory rule found after reading these results, X1 = D1 and D2, flagged 2 of 4 held-out planted markets and none of the 12 decoys or 8 talk-without-action markets. Study 2 tests it.</w:t>
+        <w:t xml:space="preserve">None of H1 to H4 survives Holm correction (all adjusted p = 1.00). Telling sellers they were monitored did not lower the judge's scores. Every C6 market still reached 4, and dependence changed by -0.08 (p = 0.61); the sellers talked first, before the gag cut their messages to fragments such as "COMP". After reading these results I tried one exploratory rule, X1 = D1 and D2. It flagged 2 of 4 held-out planted markets and none of the 12 decoys or 8 talk-without-action markets. Study 2 tests it properly.</w:t>
       </w:r>
     </w:p>
     <w:p>
@@ -1277,7 +1277,7 @@
         <w:t xml:space="preserve">Positive controls.</w:t>
       </w:r>
       <w:r>
-        <w:t xml:space="preserve"> The price-floor instruction worked: the mean collusion index was 0.75 in C8 against 0.01 in C2, a contrast of 0.74 against the preregistered 0.3 (p = 0.0002). C1 replicated Study 1, with a contrast of 0.30 (p = 0.0006). All 56 markets finished; 63 seller replies failed to parse and left the previous ask in place.</w:t>
+        <w:t xml:space="preserve"> The price-floor instruction worked. The mean collusion index was 0.75 in C8 against 0.01 in C2, a contrast of 0.74 against the preregistered 0.3 (p = 0.0002). C1 replicated Study 1, with a contrast of 0.30 (p = 0.0006). All 56 markets finished; 63 seller replies failed to parse and left the previous ask in place.</w:t>
       </w:r>
     </w:p>
     <w:p>
@@ -1702,7 +1702,7 @@
         <w:t xml:space="preserve">The extraction judge removed half of the vendored judge's false alarms (H7 supported).</w:t>
       </w:r>
       <w:r>
-        <w:t xml:space="preserve"> On the 15 C3 and C5 markets that priced at cost, D2 flagged 15 and D2x flagged 7 (exact McNemar p = 0.008, Holm-adjusted 0.039), while D2x still caught 15 of 16 planted markets. Its 3 false alarms were all talk-without-action markets in which sellers proposed a high common price in words but, in the C2 actions they were paired with, nobody raised prices. As a secondary check on Study 1's markets, which had already been read, D2x flagged 3 of 8 C3 markets and none of 8 C6 markets, where the vendored judge had flagged all of them.</w:t>
+        <w:t xml:space="preserve"> On the 15 C3 and C5 markets that priced at cost, D2 flagged 15 and D2x flagged 7 (exact McNemar p = 0.008, Holm-adjusted 0.039). D2x still caught 15 of 16 planted markets. Its 3 false alarms were all talk-without-action markets: sellers proposed a high common price in words, but in the C2 actions they were paired with, nobody raised prices. As a secondary check on Study 1's markets, which I had already read, D2x flagged 3 of 8 C3 markets and none of 8 C6 markets, where the vendored judge had flagged all of them.</w:t>
       </w:r>
     </w:p>
     <w:p>
@@ -1710,10 +1710,10 @@
         <w:rPr>
           <w:b/>
         </w:rPr>
-        <w:t xml:space="preserve">Requiring two signals removed every false alarm but did not beat price level (H5, H6 not supported).</w:t>
-      </w:r>
-      <w:r>
-        <w:t xml:space="preserve"> D5 and X1 raised no false alarm on any of the 32 known negatives (Wilson interval 0 to 0.11). They missed 5 of 16 planted markets, all C1 markets whose sellers agreed in words but let prices fall below the D1 threshold. Price level alone made the same 5 errors in Study 2: unlike Study 1, no Llama decoy reached the D1 threshold (C7 mean 0.07). Against D2, D5 traded 8 false alarms for 5 misses, which is not a significant difference (H5 p = 1.00).</w:t>
+        <w:t xml:space="preserve">Requiring two signals removed every false alarm, but did not beat price level (H5, H6 not supported).</w:t>
+      </w:r>
+      <w:r>
+        <w:t xml:space="preserve"> D5 and X1 gave no false alarm on any of the 32 known negatives (Wilson interval 0 to 0.11). They missed 5 of 16 planted markets, all C1 markets whose sellers agreed in words but let prices fall below the D1 threshold. Price level alone made the same 5 errors in Study 2, because this time no Llama decoy reached the D1 threshold (C7 mean 0.07). Against D2, D5 traded 8 false alarms for 5 misses, which is not a significant difference (H5 p = 1.00).</w:t>
       </w:r>
     </w:p>
     <w:p>
@@ -1735,7 +1735,7 @@
         <w:t xml:space="preserve">Labels.</w:t>
       </w:r>
       <w:r>
-        <w:t xml:space="preserve"> I did not hand-label the messages. Claude labelled all 24 of Study 1's C3, C5 and C6 markets in one pass, from the messages alone with condition, models and prices hidden, using the rubric fixed before the results: an agreement is two or more sellers stating or accepting a common price, floor or strategy (DEVIATIONS.md, D6). Claude had seen the study's results, so these labels are not blind and are weaker than independent human labels. By that rubric 21 of 24 markets reached an agreement (0.88 [0.69, 0.96]), in nearly every case on a price near cost, such as "$79.50 or below". The vendored judge matched these labels in 0.88 of markets only because it flagged every market (kappa 0); the extraction judge matched in 0.25 (kappa -0.04), because it flags only agreements to keep prices high. The sellers did agree; they agreed to compete.</w:t>
+        <w:t xml:space="preserve"> I did not hand-label the messages. Claude labelled all 24 of Study 1's C3, C5 and C6 markets in one pass, from the messages alone with condition, models and prices hidden, using the rubric fixed before the results: an agreement is two or more sellers stating or accepting a common price, floor or strategy (DEVIATIONS.md, D6). Claude had seen the study's results, so these labels are not blind and are weaker than independent human labels. By that rubric 21 of 24 markets reached an agreement (0.88 [0.69, 0.96]), and in nearly every case the agreed price was near cost, such as "$79.50 or below". The vendored judge matched these labels in 0.88 of markets only because it flagged every market (kappa 0). The extraction judge matched in 0.25 (kappa -0.04), because it flags only agreements to keep prices high. The sellers did agree. They agreed to compete.</w:t>
       </w:r>
     </w:p>
     <w:p>
@@ -1748,17 +1748,17 @@
     </w:p>
     <w:p>
       <w:r>
-        <w:t xml:space="preserve">For the auditor, the two studies give a consistent answer. Parallel pricing alone did not indicate agreement: the most parallel markets were ones where agreement was impossible. Coordination talk alone did not either: a judge reading "coordination" flagged every market with a channel, including all those that priced at cost. Each single signal failed in a way the plus-factors doctrine anticipates: parallel conduct without agreement (D3), talk without action (D2) and high prices without agreement (D1 on Llama markets in Study 1).</w:t>
-      </w:r>
-    </w:p>
-    <w:p>
-      <w:r>
-        <w:t xml:space="preserve">Two changes help. First, a message judge should report what price the talk proposes rather than whether it sounds coordinated; that one change halved the false alarms on talk at cost, in a preregistered test. Second, a rule that needs a supracompetitive price as well as price-holding talk flagged none of the 32 known negatives in Study 2, nor on Study 1's held-out decoys and talk-without-action markets. In Study 2 price level alone did as well, because no decoy happened to price high, so the two studies together show the conjunction protecting against a failure that appears in some markets and not others. Its cost is plain: a planted agreement that does not lift prices goes unflagged. Under US law a price-fixing agreement is unlawful in itself, whether or not it succeeds [13], so an auditor who must catch failed agreements still needs the message evidence on its own, at the price of more false alarms. The preregistered D4 failed because it looked for correlated price changes; an agreement to hold a price leaves a high, flat price instead.</w:t>
-      </w:r>
-    </w:p>
-    <w:p>
-      <w:r>
-        <w:t xml:space="preserve">The limits are clear. The sellers are 7 to 8 billion parameter models with 4-bit weights, and larger models may coordinate through actions alone. Study 1's held-out cells have 4 markets and Study 2's known set has 48, so several intervals are wide. The market is one design with three sellers. The vendored judge is from the same family as most sellers and saturates at its top score; the cross-family check did not find a significant difference, but with 32 markets it could miss a moderate one. The agreement labels come from Claude in one pass, not blind to the results; human labels would be a stronger check. The talk-without-action markets are constructed, not observed, and the extraction judge's rule borrows the D1 threshold, so the two are not fully independent.</w:t>
+        <w:t xml:space="preserve">For the auditor, both studies say the same thing. Parallel pricing alone did not show agreement: the most parallel markets were the ones where agreement was impossible. Coordination talk alone did not show it either: a judge reading for "coordination" flagged every market with a channel, including all those that priced at cost. Each single signal failed in a way the plus-factors doctrine predicts: parallel conduct without agreement (D3), talk without action (D2), and high prices without agreement (D1 on the Llama markets in Study 1).</w:t>
+      </w:r>
+    </w:p>
+    <w:p>
+      <w:r>
+        <w:t xml:space="preserve">Two changes helped. First, a message judge should report what price the talk proposes, not whether the talk sounds coordinated. That one change halved the false alarms on talk at cost, in a preregistered test. Second, a rule that needs a supracompetitive price as well as price-holding talk flagged none of the 32 known negatives in Study 2, and none of Study 1's held-out decoys or talk-without-action markets. In Study 2, price level alone did as well, because no decoy happened to price high. Taken together, the two studies show the conjunction guarding against a failure that shows up in some markets and not others. The cost is real: a planted agreement that does not lift prices goes unflagged. Under US law a price-fixing agreement is unlawful in itself, whether or not it succeeds [13], so an auditor who has to catch failed agreements still needs the message evidence on its own, and must accept more false alarms. As for the preregistered D4, it failed because it looked for correlated price changes, while an agreement to hold a price leaves a high, flat price instead.</w:t>
+      </w:r>
+    </w:p>
+    <w:p>
+      <w:r>
+        <w:t xml:space="preserve">The limits are clear. The sellers are 7 to 8 billion parameter models with 4-bit weights, and larger models may coordinate through actions alone. Study 1's held-out cells have 4 markets and Study 2's known set has 48, so several intervals are wide. The market is one design with three sellers. The vendored judge is from the same family as most sellers and saturates at its top score; the cross-family check found no significant difference, but with 32 markets it could miss a moderate one. The agreement labels come from Claude in one pass, not blind to the results, and human labels would be a stronger check. The talk-without-action markets are constructed, not observed, and the extraction judge's rule borrows the D1 threshold, so the two are not fully independent.</w:t>
       </w:r>
     </w:p>
     <w:p>
@@ -1771,7 +1771,7 @@
     </w:p>
     <w:p>
       <w:r>
-        <w:t xml:space="preserve">In LLM seller markets, neither parallel price changes nor coordination talk was reliable evidence of collusion, and high prices misled in one of two studies. A preregistered second study showed that a judge which extracts the proposed price halves the message judge's false alarms, and that requiring both high prices and price-holding talk produced no false alarms at the cost of missing failed agreements. The next step is to test these rules with larger models, more sellers and a second market, and to measure how often failed agreements matter in practice.</w:t>
+        <w:t xml:space="preserve">In these LLM seller markets, neither parallel price changes nor coordination talk was reliable evidence of collusion, and high prices misled in one of the two studies. The preregistered second study showed that a judge which extracts the proposed price halves the message judge's false alarms, and that requiring both high prices and price-holding talk produced no false alarms, at the cost of missing failed agreements. The next step is to test these rules with larger models, more sellers and a second market, and to measure how often failed agreements matter in practice.</w:t>
       </w:r>
     </w:p>
     <w:p>
@@ -1832,7 +1832,7 @@
     </w:p>
     <w:p>
       <w:r>
-        <w:t xml:space="preserve">Prior work, with dates. Before the sprint (14–18 October 2026) I chose the question. Claude drafted the question card and both preregistrations, which I reviewed. I froze the Study 1 preregistration on 16 October and the Study 2 preregistration on 18 October, each before its markets ran. The harness and analysis code were built on 17 and 18 October. Both studies ran on Kaggle on 17 and 18 October, and the analysis, the agreement labels and the draft of this report were produced on 18 October. Study 2 was originally planned for the sprint weekend and was run early instead; study2/DEVIATIONS.md records the change.</w:t>
+        <w:t xml:space="preserve">Prior work, with dates. Before the sprint (14–18 October 2026) I chose the question. Claude drafted the question card and both preregistrations, which were frozen at my direction: Study 1's on 16 October and Study 2's on 18 October, each before its markets ran. The harness and analysis code were built on 17 and 18 October. Both studies ran on Kaggle on 17 and 18 October, and the analysis, the agreement labels and the draft of this report were produced on 18 October. Study 2 was first planned for the sprint weekend and was run early instead; study2/DEVIATIONS.md records the change.</w:t>
       </w:r>
     </w:p>
     <w:p>
@@ -2037,7 +2037,7 @@
         <w:t xml:space="preserve">What the results do not establish.</w:t>
       </w:r>
       <w:r>
-        <w:t xml:space="preserve"> A low false-alarm rate for D4 in this market does not establish that the rule works in other markets, with larger models, or against sellers trying to evade it. A flag from any detector here does not establish that a real firm colluded: the markets are simulated, the stakes are zero, and the definition of agreement is the one in the labelling guide. The results also do not establish what US or any other law requires; the legal doctrine is used as a design idea, not applied to facts.</w:t>
+        <w:t xml:space="preserve"> A low false-alarm rate in this market does not establish that any of these rules works in other markets, with larger models, or against sellers trying to evade it. A flag from any detector here does not establish that a real firm colluded: the markets are simulated, nothing is at stake, and agreement means what the labelling rubric says. The results also do not establish what US or any other law requires; I used the legal doctrine as a design idea, not applied it to facts.</w:t>
       </w:r>
     </w:p>
     <w:p>
@@ -2048,7 +2048,7 @@
         <w:t xml:space="preserve">Dual use.</w:t>
       </w:r>
       <w:r>
-        <w:t xml:space="preserve"> Describing what a detector checks also describes how to pass it. D4 can be evaded by coordinating without messages, by acting on a message after more than 2 hours, or by keeping asks spread apart. The monitoring condition shows one way sellers change their messages when told they are watched. I judged these risks small: the evasions are obvious from the rule itself, the models are small open-weight models, and the paper releases no technique for hiding coordination. The benefit is a test that auditors can run before they accuse anyone on the strength of parallel prices.</w:t>
+        <w:t xml:space="preserve"> Saying what a detector checks also says how to pass it. D4 can be evaded by coordinating without messages, by acting on a message after more than 2 hours, or by keeping asks spread apart, and the conjunction rules can be evaded by agreeing without naming a price. The monitoring condition shows one way sellers change their messages when told they are watched. I judged these risks small: the evasions follow directly from the rules, the models are small open-weight models, and this paper releases no technique for hiding coordination. What it offers in return is a test an auditor can run before accusing anyone on the strength of parallel prices.</w:t>
       </w:r>
     </w:p>
     <w:p>
@@ -2059,7 +2059,7 @@
         <w:t xml:space="preserve">Ethics.</w:t>
       </w:r>
       <w:r>
-        <w:t xml:space="preserve"> No people took part. The only human data are my own labels. The study used open-weight models on free Kaggle GPUs and no paid API.</w:t>
+        <w:t xml:space="preserve"> No people took part and no human data were collected. The study used open-weight models on free Kaggle GPUs and no paid API.</w:t>
       </w:r>
     </w:p>
     <w:p>
@@ -2072,7 +2072,7 @@
     </w:p>
     <w:p>
       <w:r>
-        <w:t xml:space="preserve">Claude (Anthropic, model Claude Opus 5.5), used as a coding agent in Claude Code, wrote the code that connects the Agrawal et al. [2] market to the logged model client and the analysis scripts, drafted the question card and both preregistrations, ran the experiments on Kaggle, labelled the messages used to check the judges, and drafted all of the text of this report. I chose the research question and the track, directed the work at each step, and decided to run both studies before the sprint. Every number in the report was checked automatically against the analysis outputs (rops-claims verify). The sellers and judges in the experiments are the open-weight models named in Methods.</w:t>
+        <w:t xml:space="preserve">Claude (Anthropic, model Claude Opus 5.5), used as a coding agent in Claude Code, wrote the code that connects the Agrawal et al. [2] market to the logged model client and the analysis scripts, drafted the question card and both preregistrations, ran the experiments on Kaggle, labelled the messages used to check the judges, and wrote all of the text of this report, including a final revision meant to match my writing style. I chose the research question and the track, directed the work at each step, and decided to run both studies before the sprint. Every number in the report was checked automatically against the analysis outputs (rops-claims verify). The sellers and judges in the experiments are the open-weight models named in Methods.</w:t>
       </w:r>
     </w:p>
     <w:sectPr>

</xml_diff>